<commit_message>
docs: laporan individu, rapikan paragraf, perbarui slide dan README
</commit_message>
<xml_diff>
--- a/submission/Laporan_UAS_Blockchain.docx
+++ b/submission/Laporan_UAS_Blockchain.docx
@@ -223,7 +223,7 @@
                 <w:sz w:val="24"/>
                 <w:szCs w:val="24"/>
               </w:rPr>
-              <w:t>UAS kelompok</w:t>
+              <w:t>UAS individu</w:t>
             </w:r>
           </w:p>
         </w:tc>
@@ -320,7 +320,7 @@
                 <w:szCs w:val="24"/>
                 <w:highlight w:val="yellow"/>
               </w:rPr>
-              <w:t>[Isi nama dan NPM seluruh anggota]</w:t>
+              <w:t>[Isi nama dan NPM]</w:t>
             </w:r>
           </w:p>
         </w:tc>
@@ -345,7 +345,7 @@
                 <w:sz w:val="24"/>
                 <w:szCs w:val="24"/>
               </w:rPr>
-              <w:t>Anggota dan peran (UAS)</w:t>
+              <w:t>Kelas / semester</w:t>
             </w:r>
           </w:p>
         </w:tc>
@@ -367,9 +367,8 @@
               <w:rPr>
                 <w:sz w:val="24"/>
                 <w:szCs w:val="24"/>
-                <w:highlight w:val="yellow"/>
-              </w:rPr>
-              <w:t>[Isi: Nama — NPM — kontribusi/commit, sesuai riwayat commit repositori tim]</w:t>
+              </w:rPr>
+              <w:t>[Isi kelas] / 7</w:t>
             </w:r>
           </w:p>
         </w:tc>
@@ -394,7 +393,7 @@
                 <w:sz w:val="24"/>
                 <w:szCs w:val="24"/>
               </w:rPr>
-              <w:t>Kelas / semester</w:t>
+              <w:t>Mata kuliah / kode</w:t>
             </w:r>
           </w:p>
         </w:tc>
@@ -406,18 +405,18 @@
           <w:p>
             <w:pPr>
               <w:spacing w:after="40"/>
-              <w:jc w:val="left"/>
-              <w:rPr>
-                <w:sz w:val="24"/>
-                <w:szCs w:val="24"/>
-              </w:rPr>
-            </w:pPr>
-            <w:r>
-              <w:rPr>
-                <w:sz w:val="24"/>
-                <w:szCs w:val="24"/>
-              </w:rPr>
-              <w:t>[Isi kelas] / 7</w:t>
+              <w:jc w:val="both"/>
+              <w:rPr>
+                <w:sz w:val="24"/>
+                <w:szCs w:val="24"/>
+              </w:rPr>
+            </w:pPr>
+            <w:r>
+              <w:rPr>
+                <w:sz w:val="24"/>
+                <w:szCs w:val="24"/>
+              </w:rPr>
+              <w:t>Blockchain / KP70067008</w:t>
             </w:r>
           </w:p>
         </w:tc>
@@ -442,7 +441,7 @@
                 <w:sz w:val="24"/>
                 <w:szCs w:val="24"/>
               </w:rPr>
-              <w:t>Mata kuliah / kode</w:t>
+              <w:t>Dosen pengampu</w:t>
             </w:r>
           </w:p>
         </w:tc>
@@ -465,7 +464,23 @@
                 <w:sz w:val="24"/>
                 <w:szCs w:val="24"/>
               </w:rPr>
-              <w:t>Blockchain / KP70067008</w:t>
+              <w:t xml:space="preserve">Dr. Ir. Nur Widiyasono, </w:t>
+            </w:r>
+            <w:proofErr w:type="gramStart"/>
+            <w:r>
+              <w:rPr>
+                <w:sz w:val="24"/>
+                <w:szCs w:val="24"/>
+              </w:rPr>
+              <w:t>M.Kom</w:t>
+            </w:r>
+            <w:proofErr w:type="gramEnd"/>
+            <w:r>
+              <w:rPr>
+                <w:sz w:val="24"/>
+                <w:szCs w:val="24"/>
+              </w:rPr>
+              <w:t>.</w:t>
             </w:r>
           </w:p>
         </w:tc>
@@ -490,7 +505,7 @@
                 <w:sz w:val="24"/>
                 <w:szCs w:val="24"/>
               </w:rPr>
-              <w:t>Dosen pengampu</w:t>
+              <w:t>Tanggal kegiatan</w:t>
             </w:r>
           </w:p>
         </w:tc>
@@ -502,82 +517,18 @@
           <w:p>
             <w:pPr>
               <w:spacing w:after="40"/>
-              <w:jc w:val="both"/>
-              <w:rPr>
-                <w:sz w:val="24"/>
-                <w:szCs w:val="24"/>
-              </w:rPr>
-            </w:pPr>
-            <w:r>
-              <w:rPr>
-                <w:sz w:val="24"/>
-                <w:szCs w:val="24"/>
-              </w:rPr>
-              <w:t xml:space="preserve">Dr. Ir. Nur Widiyasono, </w:t>
-            </w:r>
-            <w:proofErr w:type="gramStart"/>
-            <w:r>
-              <w:rPr>
-                <w:sz w:val="24"/>
-                <w:szCs w:val="24"/>
-              </w:rPr>
-              <w:t>M.Kom</w:t>
-            </w:r>
-            <w:proofErr w:type="gramEnd"/>
-            <w:r>
-              <w:rPr>
-                <w:sz w:val="24"/>
-                <w:szCs w:val="24"/>
-              </w:rPr>
-              <w:t>.</w:t>
-            </w:r>
-          </w:p>
-        </w:tc>
-      </w:tr>
-      <w:tr>
-        <w:tc>
-          <w:tcPr>
-            <w:tcW w:w="4824" w:type="dxa"/>
-            <w:vAlign w:val="center"/>
-          </w:tcPr>
-          <w:p>
-            <w:pPr>
-              <w:spacing w:after="40"/>
-              <w:jc w:val="both"/>
-              <w:rPr>
-                <w:sz w:val="24"/>
-                <w:szCs w:val="24"/>
-              </w:rPr>
-            </w:pPr>
-            <w:r>
-              <w:rPr>
-                <w:sz w:val="24"/>
-                <w:szCs w:val="24"/>
-              </w:rPr>
-              <w:t>Tanggal kegiatan</w:t>
-            </w:r>
-          </w:p>
-        </w:tc>
-        <w:tc>
-          <w:tcPr>
-            <w:tcW w:w="4824" w:type="dxa"/>
-            <w:vAlign w:val="center"/>
-          </w:tcPr>
-          <w:p>
-            <w:pPr>
-              <w:spacing w:after="40"/>
-              <w:jc w:val="left"/>
-              <w:rPr>
-                <w:sz w:val="24"/>
-                <w:szCs w:val="24"/>
-              </w:rPr>
-            </w:pPr>
-            <w:r>
-              <w:rPr>
-                <w:sz w:val="24"/>
-                <w:szCs w:val="24"/>
-              </w:rPr>
-              <w:t>21 Oktober 2026 (eksekusi pengujian, audit, dan deployment pada local network)</w:t>
+              <w:jc w:val="left"/>
+              <w:rPr>
+                <w:sz w:val="24"/>
+                <w:szCs w:val="24"/>
+              </w:rPr>
+            </w:pPr>
+            <w:r>
+              <w:rPr>
+                <w:sz w:val="24"/>
+                <w:szCs w:val="24"/>
+              </w:rPr>
+              <w:t>21 Oktober 2026 (pengujian, audit, dan deployment pada local network)</w:t>
             </w:r>
           </w:p>
         </w:tc>
@@ -614,7 +565,7 @@
     </w:p>
     <w:p>
       <w:pPr>
-        <w:spacing w:line="240" w:lineRule="auto"/>
+        <w:spacing w:line="276" w:lineRule="auto" w:before="0" w:after="120"/>
         <w:jc w:val="both"/>
         <w:rPr>
           <w:sz w:val="24"/>
@@ -622,22 +573,34 @@
         </w:rPr>
       </w:pPr>
       <w:r>
-        <w:rPr/>
-        <w:t>Laporan ini menjawab permasalahan utama UAS: apakah solusi blockchain yang dibangun layak, aman, teruji, dapat direproduksi, serta memiliki arsitektur dan tata kelola yang dapat dipertanggungjawabkan. Use case yang dikerjakan adalah CertiChain, registri sertifikat/ijazah digital lintas pihak (admin, issuer, holder, verifier) dengan prinsip hanya hash dokumen yang dicatat on-chain. Solusi dibangun dengan Solidity 0.8.24, diuji dengan Hardhat (ethers v6), dan dijalankan pada local blockchain Hardhat (chain ID 31337) tanpa aset kripto nyata.</w:t>
+        <w:rPr>
+          <w:sz w:val="22"/>
+        </w:rPr>
+        <w:t>Laporan ini membahas pertanyaan utama UAS: apakah solusi blockchain yang dibangun layak, aman, teruji, dapat direproduksi, dan memiliki arsitektur serta tata kelola yang dapat dipertanggungjawabkan. Kasus yang dikerjakan adalah CertiChain, registri sertifikat digital yang dipakai bersama oleh beberapa penerbit. Hanya hash dokumen yang disimpan di blockchain, sedangkan berkas dan data pribadi tetap berada di luar rantai. Kontrak ditulis dengan Solidity 0.8.24, diuji dengan Hardhat, dan dijalankan pada local blockchain tanpa aset kripto nyata.</w:t>
       </w:r>
     </w:p>
     <w:p>
-      <w:pPr/>
+      <w:pPr>
+        <w:spacing w:before="0" w:after="120" w:line="276" w:lineRule="auto"/>
+        <w:jc w:val="both"/>
+      </w:pPr>
       <w:r>
-        <w:rPr/>
-        <w:t>Metode: desain arsitektur dan model data; implementasi kontrak v2 dengan role-based access control, stake issuer, event, dan library; 31 unit test (positif, negatif, batas, akses) ditambah 6 PoC eksploit; audit mandiri berbasis threat model dan analisis statis Slither terhadap baseline v1 yang sengaja rentan; perbaikan serta retest. Hasil: 37 tes lulus, coverage CertiChain.sol 100 % statement/function/line dan 90 % branch; tujuh temuan (A-01 sampai A-07) diklasifikasikan, enam diperbaiki dan terverifikasi, satu bersifat informasional (A-06); deployment dan interaksi end-to-end tercatat dengan contract address, transaction hash, dan event yang dapat diverifikasi. Rekomendasi arsitektur akhir: untuk produksi, gunakan blockchain permissioned/konsorsium berbasis EVM dengan verifikasi publik read-only; public blockchain tidak diperlukan untuk penyimpanan, dan database tradisional dengan tanda tangan digital cukup bila hanya ada satu penerbit.</w:t>
+        <w:rPr>
+          <w:sz w:val="22"/>
+        </w:rPr>
+        <w:t>Penulis merancang arsitektur dan model data, membuat kontrak dengan pembagian peran admin dan issuer, lalu menguji kontrak dengan 31 unit test. Audit dilakukan pada versi awal kontrak yang sengaja dibuat rentan, menggunakan threat model, enam PoC eksploit, dan analisis statis Slither. Hasilnya tujuh temuan: enam diperbaiki dan diverifikasi ulang, satu bersifat informasional. Seluruh 37 tes lulus dan coverage kontrak utama mencapai 100% untuk statement, function, dan line.</w:t>
       </w:r>
     </w:p>
     <w:p>
-      <w:pPr/>
+      <w:pPr>
+        <w:spacing w:before="0" w:after="120" w:line="276" w:lineRule="auto"/>
+        <w:jc w:val="both"/>
+      </w:pPr>
       <w:r>
-        <w:rPr/>
-        <w:t>Keterbatasan: audit bersifat mandiri (tanpa fuzzing/verifikasi formal); frontend belum diuji otomatis di peramban dengan MetaMask; admin tunggal pada prototipe; use case dan data bersifat simulasi.</w:t>
+        <w:rPr>
+          <w:sz w:val="22"/>
+        </w:rPr>
+        <w:t>Untuk penggunaan nyata, penulis merekomendasikan blockchain permissioned berbasis EVM yang dikelola konsorsium penerbit. Keterbatasan pekerjaan ini: audit dilakukan sendiri tanpa fuzzing, frontend belum diuji otomatis di peramban, dan data yang dipakai hanya simulasi.</w:t>
       </w:r>
     </w:p>
     <w:p>
@@ -678,7 +641,7 @@
     </w:p>
     <w:p>
       <w:pPr>
-        <w:spacing w:line="240" w:lineRule="auto"/>
+        <w:spacing w:line="276" w:lineRule="auto" w:before="0" w:after="120"/>
         <w:jc w:val="both"/>
         <w:rPr>
           <w:sz w:val="24"/>
@@ -686,31 +649,46 @@
         </w:rPr>
       </w:pPr>
       <w:r>
-        <w:rPr/>
-        <w:t>Penerbitan sertifikat dan ijazah masih bergantung pada dokumen berbasis kertas atau PDF yang mudah dipalsukan, serta verifikasi manual ke institusi penerbit yang lambat dan sulit diaudit lintas pihak. Permasalahan utama yang diangkat: bagaimana sebuah organisasi dengan beberapa penerbit yang tidak saling mempercayai dapat mencatat penerbitan dan pencabutan sertifikat dengan audit trail yang kuat, kontrol akses yang terukur, serta verifikasi publik yang murah, tanpa membuka data pribadi pemegang sertifikat.</w:t>
+        <w:rPr>
+          <w:sz w:val="22"/>
+        </w:rPr>
+        <w:t>Sertifikat dan ijazah masih sering beredar sebagai PDF atau kertas yang mudah dipalsukan. Pihak yang ingin memastikan keasliannya biasanya harus menghubungi penerbit secara manual, dan prosesnya lambat. Bila penerbitnya banyak dan tidak saling percaya, tidak ada catatan bersama yang dapat diaudit oleh semua pihak.</w:t>
       </w:r>
     </w:p>
     <w:p>
-      <w:pPr/>
+      <w:pPr>
+        <w:spacing w:before="0" w:after="120" w:line="276" w:lineRule="auto"/>
+        <w:jc w:val="both"/>
+      </w:pPr>
       <w:r>
-        <w:rPr/>
-        <w:t>Pertanyaan yang dijawab: (1) apakah desain on-chain/off-chain dan kontrol akses sudah konsisten dengan kebutuhan trust; (2) apakah kontrak dapat diuji, di-debug, di-deploy, dan diintegrasikan dengan client; (3) apakah kerentanan umum smart contract dapat diidentifikasi, diperbaiki, dan dibuktikan; (4) apakah public blockchain adalah pilihan paling tepat dibandingkan permissioned blockchain atau database tradisional.</w:t>
+        <w:rPr>
+          <w:sz w:val="22"/>
+        </w:rPr>
+        <w:t>Kasus yang diangkat adalah organisasi dengan beberapa penerbit yang membutuhkan pencatatan penerbitan dan pencabutan sertifikat, jejak audit yang kuat, kontrol akses yang jelas, dan verifikasi publik yang murah tanpa membuka data pribadi pemegang sertifikat.</w:t>
       </w:r>
     </w:p>
     <w:p>
-      <w:pPr/>
+      <w:pPr>
+        <w:spacing w:before="0" w:after="120" w:line="276" w:lineRule="auto"/>
+        <w:jc w:val="both"/>
+      </w:pPr>
       <w:r>
-        <w:rPr/>
-        <w:t>Target hasil dan kriteria keberhasilan: kontrak dapat dikompilasi; seluruh tes lulus dengan coverage tinggi pada fungsi inti; setiap temuan audit memiliki bukti, mitigasi, dan retest; alur end-to-end (stake → approve → issue → verify → revoke) berjalan pada local network dengan event yang dapat ditelusuri; dokumentasi memungkinkan reproduksi oleh pihak lain.</w:t>
+        <w:rPr>
+          <w:sz w:val="22"/>
+        </w:rPr>
+        <w:t>Laporan ini menjawab empat pertanyaan. Pertama, apakah pembagian data on-chain dan off-chain serta kontrol akses sudah sesuai kebutuhan. Kedua, apakah kontrak dapat diuji, di-debug, di-deploy, dan dipanggil dari client. Ketiga, apakah kerentanan umum dapat ditemukan, diperbaiki, dan dibuktikan. Keempat, apakah public blockchain memang pilihan terbaik dibandingkan blockchain permissioned atau database biasa.</w:t>
       </w:r>
     </w:p>
     <w:p>
-      <w:pPr/>
+      <w:pPr>
+        <w:spacing w:before="0" w:after="120" w:line="276" w:lineRule="auto"/>
+        <w:jc w:val="both"/>
+      </w:pPr>
       <w:r>
         <w:rPr>
-          <w:i/>
+          <w:sz w:val="22"/>
         </w:rPr>
-        <w:t>Catatan asumsi: use case CertiChain ditetapkan oleh tim sebagai use case UAS. Apabila use case yang disetujui dosen sebelum UTS berbeda, bagian domain (aktor dan aset) perlu disesuaikan; arsitektur, pola kontrak, pengujian, dan audit tetap berlaku.</w:t>
+        <w:t>Proyek dianggap berhasil bila kontrak dapat dikompilasi, semua tes lulus, setiap temuan audit memiliki bukti dan retest, alur dari stake sampai pencabutan berjalan di local network, dan langkah reproduksinya terdokumentasi.</w:t>
       </w:r>
     </w:p>
     <w:p>
@@ -733,7 +711,7 @@
     </w:p>
     <w:p>
       <w:pPr>
-        <w:spacing w:line="240" w:lineRule="auto"/>
+        <w:spacing w:line="276" w:lineRule="auto" w:before="0" w:after="120"/>
         <w:jc w:val="both"/>
         <w:rPr>
           <w:sz w:val="24"/>
@@ -741,15 +719,22 @@
         </w:rPr>
       </w:pPr>
       <w:r>
-        <w:rPr/>
-        <w:t>Ruang lingkup: satu kontrak utama (CertiChain.sol) beserta interface, library, dan modul akses; baseline rentan CertiChainV1.sol untuk keperluan audit; mock penyerang untuk pengujian; skrip deploy dan integrasi; dan frontend web sederhana. Jaringan: Hardhat local network (chain ID 31337) dengan akun uji bawaan. Data: hash dokumen dari teks sertifikat simulasi dan alamat akun uji; tidak ada data pribadi nyata.</w:t>
+        <w:rPr>
+          <w:sz w:val="22"/>
+        </w:rPr>
+        <w:t>Ruang lingkup mencakup satu kontrak utama (CertiChain.sol) beserta interface, library, dan modul akses; satu versi awal yang rentan (CertiChainV1.sol) sebagai bahan audit; dua kontrak tiruan untuk pengujian; skrip deploy dan integrasi; serta frontend web sederhana. Jaringan yang dipakai adalah Hardhat local network dengan chain ID 31337 dan akun uji bawaan. Datanya berupa hash dari teks sertifikat contoh dan alamat akun uji, tanpa data pribadi nyata.</w:t>
       </w:r>
     </w:p>
     <w:p>
-      <w:pPr/>
+      <w:pPr>
+        <w:spacing w:before="0" w:after="120" w:line="276" w:lineRule="auto"/>
+        <w:jc w:val="both"/>
+      </w:pPr>
       <w:r>
-        <w:rPr/>
-        <w:t>Batasan: tidak menggunakan aset kripto nyata, private key utama, seed phrase pribadi, atau jaringan produksi; berkas PDF sertifikat dan penyimpanan off-chain (database/IPFS) disimulasikan; tidak ada integrasi oracle eksternal; frontend dirancang untuk MetaMask atau JSON-RPC lokal namun belum diuji otomatis di peramban.</w:t>
+        <w:rPr>
+          <w:sz w:val="22"/>
+        </w:rPr>
+        <w:t>Batasannya: tidak ada aset kripto nyata, private key utama, seed phrase pribadi, atau jaringan produksi. Penyimpanan berkas PDF di luar rantai hanya disimulasikan, tidak ada oracle eksternal, dan frontend belum diuji otomatis di peramban.</w:t>
       </w:r>
     </w:p>
     <w:p>
@@ -794,7 +779,7 @@
           <w:p>
             <w:pPr>
               <w:spacing w:after="40"/>
-              <w:jc w:val="both"/>
+              <w:jc w:val="left"/>
               <w:rPr>
                 <w:sz w:val="24"/>
                 <w:szCs w:val="24"/>
@@ -819,7 +804,7 @@
           <w:p>
             <w:pPr>
               <w:spacing w:after="40"/>
-              <w:jc w:val="both"/>
+              <w:jc w:val="left"/>
               <w:rPr>
                 <w:sz w:val="24"/>
                 <w:szCs w:val="24"/>
@@ -1035,7 +1020,7 @@
                 <w:sz w:val="24"/>
                 <w:szCs w:val="24"/>
               </w:rPr>
-              <w:t>Repositori git lokal tim (cabang main): 1caf3a8 baseline V1; 5b6ae73 PoC eksploit; 713466f perbaikan V2 + retest; 0ebe60b deploy, integrasi, frontend. [Isi tautan repositori tim]</w:t>
+              <w:t>Commit 1caf3a8 (versi awal), 5b6ae73 (PoC eksploit), 713466f (perbaikan dan retest), 0ebe60b (deploy, integrasi, frontend). [Isi tautan repositori]</w:t>
             </w:r>
           </w:p>
         </w:tc>
@@ -1137,7 +1122,7 @@
                 <w:sz w:val="24"/>
                 <w:szCs w:val="24"/>
               </w:rPr>
-              <w:t>npm install --legacy-peer-deps → npx hardhat compile → npx hardhat test → npx hardhat node (terminal 1) → npx hardhat run scripts/deploy.js --network localhost → npx hardhat run scripts/interact.js --network localhost. Rincian pada README.md.</w:t>
+              <w:t>npm install --legacy-peer-deps, npx hardhat compile, npx hardhat test, npx hardhat node (terminal 1), lalu npx hardhat run scripts/deploy.js --network localhost dan scripts/interact.js. Rincian ada di README.md.</w:t>
             </w:r>
           </w:p>
         </w:tc>
@@ -1145,7 +1130,7 @@
     </w:tbl>
     <w:p>
       <w:pPr>
-        <w:spacing w:line="240" w:lineRule="auto"/>
+        <w:spacing w:line="276" w:lineRule="auto" w:before="0" w:after="120"/>
         <w:jc w:val="both"/>
         <w:rPr>
           <w:sz w:val="24"/>
@@ -1196,7 +1181,7 @@
           <w:p>
             <w:pPr>
               <w:spacing w:after="40"/>
-              <w:jc w:val="both"/>
+              <w:jc w:val="left"/>
               <w:rPr>
                 <w:sz w:val="24"/>
                 <w:szCs w:val="24"/>
@@ -1221,7 +1206,7 @@
           <w:p>
             <w:pPr>
               <w:spacing w:after="40"/>
-              <w:jc w:val="both"/>
+              <w:jc w:val="left"/>
               <w:rPr>
                 <w:sz w:val="24"/>
                 <w:szCs w:val="24"/>
@@ -1246,7 +1231,7 @@
           <w:p>
             <w:pPr>
               <w:spacing w:after="40"/>
-              <w:jc w:val="both"/>
+              <w:jc w:val="left"/>
               <w:rPr>
                 <w:sz w:val="24"/>
                 <w:szCs w:val="24"/>
@@ -1932,7 +1917,7 @@
     </w:tbl>
     <w:p>
       <w:pPr>
-        <w:spacing w:line="240" w:lineRule="auto"/>
+        <w:spacing w:line="276" w:lineRule="auto" w:before="0" w:after="120"/>
         <w:jc w:val="both"/>
         <w:rPr>
           <w:sz w:val="24"/>
@@ -1942,7 +1927,7 @@
     </w:p>
     <w:p>
       <w:pPr>
-        <w:spacing w:line="240" w:lineRule="auto"/>
+        <w:spacing w:line="276" w:lineRule="auto" w:before="0" w:after="120"/>
         <w:jc w:val="both"/>
         <w:rPr>
           <w:sz w:val="24"/>
@@ -1950,8 +1935,10 @@
         </w:rPr>
       </w:pPr>
       <w:r>
-        <w:rPr/>
-        <w:t>Setiap bukti diberi kode B-01, B-02, dan seterusnya (pemetaan ke berkas pada Lampiran). Bukti tidak memuat private key, seed phrase, token akses, atau kredensial; akun yang tampil adalah akun uji bawaan Hardhat yang bersifat publik.</w:t>
+        <w:rPr>
+          <w:sz w:val="22"/>
+        </w:rPr>
+        <w:t>Setiap bukti diberi kode B-01, B-02, dan seterusnya. Pemetaan kode ke berkas ada di Lampiran. Bukti tidak memuat private key, seed phrase, token akses, atau kredensial; akun yang tampil adalah akun uji bawaan Hardhat yang kuncinya memang publik.</w:t>
       </w:r>
     </w:p>
     <w:p>
@@ -1986,7 +1973,7 @@
     </w:p>
     <w:p>
       <w:pPr>
-        <w:spacing w:line="240" w:lineRule="auto"/>
+        <w:spacing w:line="276" w:lineRule="auto" w:before="0" w:after="120"/>
         <w:jc w:val="both"/>
         <w:rPr>
           <w:sz w:val="24"/>
@@ -1994,22 +1981,43 @@
         </w:rPr>
       </w:pPr>
       <w:r>
-        <w:rPr/>
-        <w:t>Stakeholder dan aset. Admin/konsorsium mengatur peran dan sanksi; Issuer (institusi penerbit) menerbitkan dan mencabut sertifikat; Holder menerima dan membawa sertifikat; Verifier (pemberi kerja, kampus lain, publik) memverifikasi keaslian; Auditor/regulator menelusuri event. Aset utama: hash dokumen dan status sertifikat, stake issuer (ETH uji), peran ADMIN/ISSUER, serta log event sebagai audit trail.</w:t>
+        <w:rPr>
+          <w:sz w:val="22"/>
+        </w:rPr>
+        <w:t>Ada lima pihak dalam sistem. Admin mengatur peran dan sanksi. Issuer adalah institusi penerbit yang menerbitkan dan mencabut sertifikat. Holder adalah penerima sertifikat. Verifier, misalnya pemberi kerja atau kampus lain, memeriksa keaslian sertifikat. Auditor atau regulator menelusuri riwayat lewat event. Aset yang dilindungi adalah hash dokumen beserta statusnya, stake issuer dalam ETH uji, peran ADMIN dan ISSUER, serta log event sebagai jejak audit.</w:t>
       </w:r>
     </w:p>
     <w:p>
-      <w:pPr/>
+      <w:pPr>
+        <w:spacing w:before="0" w:after="120" w:line="276" w:lineRule="auto"/>
+        <w:jc w:val="both"/>
+      </w:pPr>
       <w:r>
-        <w:rPr/>
-        <w:t>Kebutuhan trust. Beberapa issuer yang tidak saling mempercayai membutuhkan catatan bersama yang tidak dapat diubah diam-diam, urutan peristiwa yang dapat diaudit, dan verifikasi tanpa meminta izin kepada penerbit. Insentif jujur dijaga lewat stake: issuer yang menyalahgunakan dapat dikenai slash dan ditangguhkan.</w:t>
+        <w:rPr>
+          <w:sz w:val="22"/>
+        </w:rPr>
+        <w:t>Karena penerbitnya banyak dan tidak saling percaya, mereka membutuhkan catatan bersama yang tidak bisa diubah diam-diam, urutan kejadian yang dapat diaudit, dan verifikasi tanpa harus meminta izin ke penerbit. Kejujuran issuer dijaga dengan stake: issuer yang menyalahgunakan wewenang dapat dikenai slash dan ditangguhkan.</w:t>
       </w:r>
     </w:p>
     <w:p>
-      <w:pPr/>
+      <w:pPr>
+        <w:pStyle w:val="Heading3"/>
+      </w:pPr>
       <w:r>
         <w:rPr/>
-        <w:t>Alur transaksi (Gambar 2): deposit stake → approveIssuer oleh admin → hash dokumen dihitung off-chain → issueCertificate → verifyCertificate (view, gratis) → revokeCertificate bila perlu → sanksi (slash) atau resign dan penarikan stake.</w:t>
+        <w:t>Alur transaksi dan arsitektur</w:t>
+      </w:r>
+    </w:p>
+    <w:p>
+      <w:pPr>
+        <w:spacing w:before="0" w:after="120" w:line="276" w:lineRule="auto"/>
+        <w:jc w:val="both"/>
+      </w:pPr>
+      <w:r>
+        <w:rPr>
+          <w:sz w:val="22"/>
+        </w:rPr>
+        <w:t>Alur transaksi ditunjukkan pada Gambar 2. Calon issuer menyetor stake, admin menyetujuinya, lalu issuer menghitung hash dokumen di luar rantai dan menerbitkan sertifikat. Siapa pun dapat memverifikasi sertifikat tanpa biaya. Jika ada kesalahan, issuer asli atau admin dapat mencabut sertifikat. Issuer yang melanggar dapat dikenai slash, sedangkan issuer yang berhenti dapat menarik stake-nya.</w:t>
       </w:r>
     </w:p>
     <w:p>
@@ -2058,7 +2066,7 @@
       </w:pPr>
       <w:r>
         <w:rPr/>
-        <w:t>Gambar 1. Arsitektur frontend – wallet/provider – smart contract – jaringan – komponen off-chain (B-01)</w:t>
+        <w:t>Gambar 1. Arsitektur frontend, wallet/provider, smart contract, jaringan, dan komponen off-chain (B-01)</w:t>
       </w:r>
     </w:p>
     <w:p>
@@ -2111,16 +2119,115 @@
       </w:r>
     </w:p>
     <w:p>
-      <w:pPr/>
+      <w:pPr>
+        <w:pStyle w:val="Heading3"/>
+      </w:pPr>
+      <w:r>
+        <w:rPr/>
+        <w:t>Fitur Solidity yang dipakai</w:t>
+      </w:r>
+    </w:p>
+    <w:p>
+      <w:pPr>
+        <w:pStyle w:val="ListBullet"/>
+        <w:spacing w:before="0" w:after="60" w:line="276" w:lineRule="auto"/>
+        <w:jc w:val="left"/>
+      </w:pPr>
       <w:r>
         <w:rPr>
-          <w:b/>
+          <w:sz w:val="22"/>
         </w:rPr>
-        <w:t xml:space="preserve">Fitur Solidity yang dipakai: </w:t>
+        <w:t>Function dengan visibility external, public, private, dan internal.</w:t>
       </w:r>
+    </w:p>
+    <w:p>
+      <w:pPr>
+        <w:pStyle w:val="ListBullet"/>
+        <w:spacing w:before="0" w:after="60" w:line="276" w:lineRule="auto"/>
+        <w:jc w:val="left"/>
+      </w:pPr>
       <w:r>
-        <w:rPr/>
-        <w:t>function dengan visibility external/public/private/internal; struct Certificate (dipadatkan ke 3 slot); enum Status; mapping (sertifikat, sertifikat per holder, stake, peran) dan array dinamis; modifier onlyRole, whenNotPaused, nonReentrant; event untuk setiap perubahan state penting; inheritance (CertiChain is ICertificateRegistry, AccessRoles); interface ICertificateRegistry; library CertLib (computeId, effectiveStatus); custom error dengan revert; fungsi payable dan pengiriman ETH dengan low-level call yang diperiksa hasilnya; RBAC buatan sendiri (untuk produksi disarankan OpenZeppelin AccessControl).</w:t>
+        <w:rPr>
+          <w:sz w:val="22"/>
+        </w:rPr>
+        <w:t>Struct Certificate yang dipadatkan ke tiga slot storage, enum Status, serta mapping dan array dinamis.</w:t>
+      </w:r>
+    </w:p>
+    <w:p>
+      <w:pPr>
+        <w:pStyle w:val="ListBullet"/>
+        <w:spacing w:before="0" w:after="60" w:line="276" w:lineRule="auto"/>
+        <w:jc w:val="left"/>
+      </w:pPr>
+      <w:r>
+        <w:rPr>
+          <w:sz w:val="22"/>
+        </w:rPr>
+        <w:t>Modifier onlyRole, whenNotPaused, dan nonReentrant.</w:t>
+      </w:r>
+    </w:p>
+    <w:p>
+      <w:pPr>
+        <w:pStyle w:val="ListBullet"/>
+        <w:spacing w:before="0" w:after="60" w:line="276" w:lineRule="auto"/>
+        <w:jc w:val="left"/>
+      </w:pPr>
+      <w:r>
+        <w:rPr>
+          <w:sz w:val="22"/>
+        </w:rPr>
+        <w:t>Event untuk setiap perubahan state penting.</w:t>
+      </w:r>
+    </w:p>
+    <w:p>
+      <w:pPr>
+        <w:pStyle w:val="ListBullet"/>
+        <w:spacing w:before="0" w:after="60" w:line="276" w:lineRule="auto"/>
+        <w:jc w:val="left"/>
+      </w:pPr>
+      <w:r>
+        <w:rPr>
+          <w:sz w:val="22"/>
+        </w:rPr>
+        <w:t>Inheritance (CertiChain mewarisi ICertificateRegistry dan AccessRoles), interface, dan library CertLib.</w:t>
+      </w:r>
+    </w:p>
+    <w:p>
+      <w:pPr>
+        <w:pStyle w:val="ListBullet"/>
+        <w:spacing w:before="0" w:after="60" w:line="276" w:lineRule="auto"/>
+        <w:jc w:val="left"/>
+      </w:pPr>
+      <w:r>
+        <w:rPr>
+          <w:sz w:val="22"/>
+        </w:rPr>
+        <w:t>Custom error dengan revert, fungsi payable, dan pengiriman ETH dengan low-level call yang hasilnya diperiksa.</w:t>
+      </w:r>
+    </w:p>
+    <w:p>
+      <w:pPr>
+        <w:pStyle w:val="ListBullet"/>
+        <w:spacing w:before="0" w:after="60" w:line="276" w:lineRule="auto"/>
+        <w:jc w:val="left"/>
+      </w:pPr>
+      <w:r>
+        <w:rPr>
+          <w:sz w:val="22"/>
+        </w:rPr>
+        <w:t>Kontrol akses berbasis peran yang ditulis sendiri. Untuk produksi, OpenZeppelin AccessControl lebih disarankan.</w:t>
+      </w:r>
+    </w:p>
+    <w:p>
+      <w:pPr>
+        <w:spacing w:before="0" w:after="120" w:line="276" w:lineRule="auto"/>
+        <w:jc w:val="both"/>
+      </w:pPr>
+      <w:r>
+        <w:rPr>
+          <w:sz w:val="22"/>
+        </w:rPr>
+        <w:t>Pembagian data dan fungsi utama dirangkum pada tabel berikut.</w:t>
       </w:r>
     </w:p>
     <w:tbl>
@@ -2149,7 +2256,7 @@
           <w:p>
             <w:pPr>
               <w:spacing w:after="40"/>
-              <w:jc w:val="both"/>
+              <w:jc w:val="left"/>
               <w:rPr>
                 <w:sz w:val="24"/>
                 <w:szCs w:val="24"/>
@@ -2174,7 +2281,7 @@
           <w:p>
             <w:pPr>
               <w:spacing w:after="40"/>
-              <w:jc w:val="both"/>
+              <w:jc w:val="left"/>
               <w:rPr>
                 <w:sz w:val="24"/>
                 <w:szCs w:val="24"/>
@@ -2199,7 +2306,7 @@
           <w:p>
             <w:pPr>
               <w:spacing w:after="40"/>
-              <w:jc w:val="both"/>
+              <w:jc w:val="left"/>
               <w:rPr>
                 <w:sz w:val="24"/>
                 <w:szCs w:val="24"/>
@@ -2224,7 +2331,7 @@
           <w:p>
             <w:pPr>
               <w:spacing w:after="40"/>
-              <w:jc w:val="both"/>
+              <w:jc w:val="left"/>
               <w:rPr>
                 <w:sz w:val="24"/>
                 <w:szCs w:val="24"/>
@@ -3020,7 +3127,7 @@
     </w:tbl>
     <w:p>
       <w:pPr>
-        <w:spacing w:line="240" w:lineRule="auto"/>
+        <w:spacing w:line="276" w:lineRule="auto" w:before="0" w:after="120"/>
         <w:jc w:val="both"/>
         <w:rPr>
           <w:sz w:val="24"/>
@@ -3029,16 +3136,90 @@
       </w:pPr>
     </w:p>
     <w:p>
-      <w:pPr/>
+      <w:pPr>
+        <w:pStyle w:val="Heading3"/>
+      </w:pPr>
+      <w:r>
+        <w:rPr/>
+        <w:t>Keputusan desain dan trade-off</w:t>
+      </w:r>
+    </w:p>
+    <w:p>
+      <w:pPr>
+        <w:pStyle w:val="ListBullet"/>
+        <w:spacing w:before="0" w:after="60" w:line="276" w:lineRule="auto"/>
+        <w:jc w:val="left"/>
+      </w:pPr>
       <w:r>
         <w:rPr>
-          <w:b/>
+          <w:sz w:val="22"/>
         </w:rPr>
-        <w:t xml:space="preserve">Keputusan desain dan trade-off. </w:t>
+        <w:t>Hanya hash yang disimpan on-chain. Privasi dan biaya terjaga, tetapi ketersediaan berkas bergantung pada penyimpanan di luar rantai, dan hash dari data yang mudah ditebak bisa dibongkar, sehingga perlu salt acak.</w:t>
       </w:r>
+    </w:p>
+    <w:p>
+      <w:pPr>
+        <w:pStyle w:val="ListBullet"/>
+        <w:spacing w:before="0" w:after="60" w:line="276" w:lineRule="auto"/>
+        <w:jc w:val="left"/>
+      </w:pPr>
       <w:r>
-        <w:rPr/>
-        <w:t>(1) Hash-only on-chain: privasi dan biaya terjaga, tetapi ketersediaan berkas bergantung penyimpanan off-chain dan hash dari data berentropi rendah dapat ditebak (disarankan salt acak yang dipegang holder). (2) ID = keccak256(issuer, docHash): mencegah penyerobotan hash (A-03), dengan konsekuensi hash yang sama dari dua issuer menjadi dua catatan berbeda. (3) Stake wajib 1 ETH uji: meningkatkan akuntabilitas tetapi menambah hambatan masuk dan kompleksitas penarikan. (4) Pencabutan tetap diizinkan saat pause: keamanan lebih penting daripada kontinuitas penerbitan. (5) Kontrak tidak upgradeable: lebih mudah diaudit dan tidak ada risiko proxy, namun perubahan aturan membutuhkan deploy dan migrasi baru. (6) Admin tunggal pada prototipe: sederhana, tetapi menjadi titik sentral; produksi memerlukan multisig dan timelock.</w:t>
+        <w:rPr>
+          <w:sz w:val="22"/>
+        </w:rPr>
+        <w:t>ID sertifikat dibentuk dari keccak256(issuer, docHash) agar hash tidak bisa diserobot issuer lain (A-03). Konsekuensinya, hash yang sama dari dua issuer menjadi dua catatan terpisah.</w:t>
+      </w:r>
+    </w:p>
+    <w:p>
+      <w:pPr>
+        <w:pStyle w:val="ListBullet"/>
+        <w:spacing w:before="0" w:after="60" w:line="276" w:lineRule="auto"/>
+        <w:jc w:val="left"/>
+      </w:pPr>
+      <w:r>
+        <w:rPr>
+          <w:sz w:val="22"/>
+        </w:rPr>
+        <w:t>Stake wajib 1 ETH uji menambah akuntabilitas, tetapi menambah hambatan masuk dan kerumitan penarikan.</w:t>
+      </w:r>
+    </w:p>
+    <w:p>
+      <w:pPr>
+        <w:pStyle w:val="ListBullet"/>
+        <w:spacing w:before="0" w:after="60" w:line="276" w:lineRule="auto"/>
+        <w:jc w:val="left"/>
+      </w:pPr>
+      <w:r>
+        <w:rPr>
+          <w:sz w:val="22"/>
+        </w:rPr>
+        <w:t>Pencabutan tetap diizinkan saat kontrak di-pause, karena keamanan lebih penting daripada kelancaran penerbitan.</w:t>
+      </w:r>
+    </w:p>
+    <w:p>
+      <w:pPr>
+        <w:pStyle w:val="ListBullet"/>
+        <w:spacing w:before="0" w:after="60" w:line="276" w:lineRule="auto"/>
+        <w:jc w:val="left"/>
+      </w:pPr>
+      <w:r>
+        <w:rPr>
+          <w:sz w:val="22"/>
+        </w:rPr>
+        <w:t>Kontrak tidak dapat di-upgrade. Ini lebih mudah diaudit dan bebas risiko proxy, tetapi perubahan aturan berarti deploy ulang dan migrasi.</w:t>
+      </w:r>
+    </w:p>
+    <w:p>
+      <w:pPr>
+        <w:pStyle w:val="ListBullet"/>
+        <w:spacing w:before="0" w:after="60" w:line="276" w:lineRule="auto"/>
+        <w:jc w:val="left"/>
+      </w:pPr>
+      <w:r>
+        <w:rPr>
+          <w:sz w:val="22"/>
+        </w:rPr>
+        <w:t>Admin hanya satu pada prototipe. Sederhana, tetapi menjadi titik sentral, sehingga produksi memerlukan multisig dan timelock.</w:t>
       </w:r>
     </w:p>
     <w:p>
@@ -3083,7 +3264,7 @@
           <w:p>
             <w:pPr>
               <w:spacing w:after="40"/>
-              <w:jc w:val="both"/>
+              <w:jc w:val="left"/>
               <w:rPr>
                 <w:sz w:val="24"/>
                 <w:szCs w:val="24"/>
@@ -3108,7 +3289,7 @@
           <w:p>
             <w:pPr>
               <w:spacing w:after="40"/>
-              <w:jc w:val="both"/>
+              <w:jc w:val="left"/>
               <w:rPr>
                 <w:sz w:val="24"/>
                 <w:szCs w:val="24"/>
@@ -3133,7 +3314,7 @@
           <w:p>
             <w:pPr>
               <w:spacing w:after="40"/>
-              <w:jc w:val="both"/>
+              <w:jc w:val="left"/>
               <w:rPr>
                 <w:sz w:val="24"/>
                 <w:szCs w:val="24"/>
@@ -3158,7 +3339,7 @@
           <w:p>
             <w:pPr>
               <w:spacing w:after="40"/>
-              <w:jc w:val="both"/>
+              <w:jc w:val="left"/>
               <w:rPr>
                 <w:sz w:val="24"/>
                 <w:szCs w:val="24"/>
@@ -3183,7 +3364,7 @@
           <w:p>
             <w:pPr>
               <w:spacing w:after="40"/>
-              <w:jc w:val="both"/>
+              <w:jc w:val="left"/>
               <w:rPr>
                 <w:sz w:val="24"/>
                 <w:szCs w:val="24"/>
@@ -6923,7 +7104,7 @@
     </w:tbl>
     <w:p>
       <w:pPr>
-        <w:spacing w:line="240" w:lineRule="auto"/>
+        <w:spacing w:line="276" w:lineRule="auto" w:before="0" w:after="120"/>
         <w:jc w:val="both"/>
         <w:rPr>
           <w:sz w:val="24"/>
@@ -6933,7 +7114,7 @@
     </w:p>
     <w:p>
       <w:pPr>
-        <w:spacing w:line="240" w:lineRule="auto"/>
+        <w:spacing w:line="276" w:lineRule="auto" w:before="0" w:after="120"/>
         <w:jc w:val="both"/>
         <w:rPr>
           <w:sz w:val="24"/>
@@ -6941,25 +7122,37 @@
         </w:rPr>
       </w:pPr>
       <w:r>
-        <w:rPr/>
-        <w:t>Hasil pengujian dan cakupan. Seluruh 37 tes lulus (31 unit test V2 pada tabel di atas dan 6 PoC eksploit V1 pada bagian 4.3). Coverage CertiChain.sol: statement 100 %, branch 90 %, function 100 %, line 100 % (B-05). Skenario positif, negatif, batas, dan kontrol akses semuanya terwakili.</w:t>
+        <w:rPr>
+          <w:sz w:val="22"/>
+        </w:rPr>
+        <w:t>Seluruh 37 tes lulus: 31 unit test pada tabel di atas dan 6 PoC eksploit yang dibahas pada subbab 4.3. Coverage CertiChain.sol adalah 100% statement, 90% branch, 100% function, dan 100% line (B-05). Skenario positif, negatif, batas, dan kontrol akses sudah tercakup.</w:t>
       </w:r>
     </w:p>
     <w:p>
-      <w:pPr/>
-      <w:r>
-        <w:rPr>
-          <w:b/>
-        </w:rPr>
-        <w:t xml:space="preserve">Kasus debugging. </w:t>
-      </w:r>
+      <w:pPr>
+        <w:pStyle w:val="Heading3"/>
+      </w:pPr>
       <w:r>
         <w:rPr/>
-        <w:t>Dua kesalahan kompilasi terkontrol dibuat pada berkas docs/debug/Broken.sol. Percobaan 1 gagal karena titik koma hilang; setelah diperbaiki, percobaan 2 gagal karena konversi implisit uint256 ke uint64 tidak diizinkan; setelah explicit cast uint64(expiresAt), percobaan 3 berhasil (B-06). Selain itu, compiler memperingatkan return value low-level call yang tidak digunakan pada CertiChainV1 (B-03), yang kemudian dikonfirmasi sebagai temuan A-07.</w:t>
+        <w:t>Kasus debugging</w:t>
       </w:r>
     </w:p>
     <w:p>
-      <w:pPr/>
+      <w:pPr>
+        <w:spacing w:before="0" w:after="120" w:line="276" w:lineRule="auto"/>
+        <w:jc w:val="both"/>
+      </w:pPr>
+      <w:r>
+        <w:rPr>
+          <w:sz w:val="22"/>
+        </w:rPr>
+        <w:t>Untuk latihan debugging, penulis membuat berkas docs/debug/Broken.sol yang berisi dua kesalahan umum. Percobaan pertama gagal karena titik koma hilang. Setelah diperbaiki, percobaan kedua gagal karena uint256 tidak bisa dikonversi secara implisit ke uint64. Percobaan ketiga berhasil setelah memakai cast eksplisit uint64(expiresAt) (B-06). Compiler juga memberi peringatan bahwa return value low-level call tidak digunakan pada CertiChainV1 (B-03). Peringatan ini kemudian terbukti sebagai temuan A-07.</w:t>
+      </w:r>
+    </w:p>
+    <w:p>
+      <w:pPr>
+        <w:spacing w:after="120"/>
+      </w:pPr>
       <w:r>
         <w:rPr>
           <w:rFonts w:ascii="Consolas" w:hAnsi="Consolas" w:eastAsia="Consolas"/>
@@ -6985,42 +7178,57 @@
       </w:r>
     </w:p>
     <w:p>
-      <w:pPr/>
-      <w:r>
-        <w:rPr>
-          <w:b/>
-        </w:rPr>
-        <w:t xml:space="preserve">Compile dan deployment. </w:t>
-      </w:r>
+      <w:pPr>
+        <w:pStyle w:val="Heading3"/>
+      </w:pPr>
       <w:r>
         <w:rPr/>
-        <w:t>Kompilasi: npx hardhat compile (solc 0.8.24, 7 file berhasil). Deployment: npx hardhat node, lalu npx hardhat run scripts/deploy.js --network localhost. Network: localhost, chain ID 31337. Contract address 0x5FbDB2315678afecb367f032d93F642f64180aa3; deployment transaction hash 0x9845613a2f700b5d4ebe9708c6ac243b8cec9666d2a26506df2cf1d0410429de; block 1; gas 1.515.744; deployer/admin awal 0xf39Fd6e5…2266 (akun uji Hardhat #0) (B-08).</w:t>
+        <w:t>Compile dan deployment</w:t>
       </w:r>
     </w:p>
     <w:p>
-      <w:pPr/>
+      <w:pPr>
+        <w:spacing w:before="0" w:after="120" w:line="276" w:lineRule="auto"/>
+        <w:jc w:val="both"/>
+      </w:pPr>
       <w:r>
         <w:rPr>
-          <w:b/>
+          <w:sz w:val="22"/>
         </w:rPr>
-        <w:t xml:space="preserve">Integrasi client dan verifikasi state/event. </w:t>
-      </w:r>
-      <w:r>
-        <w:rPr/>
-        <w:t>Skrip scripts/interact.js terhubung ke node lokal melalui provider ethers dan menjalankan: depositStake (tx 0x32eba769…05d821, block 2), approveIssuer (0xd4b290a2…3000, block 3), issueCertificate (0xeca5fb48…5013, block 4, gas 141.450), verifyCertificate → Valid, revokeCertificate (0x4d2fffe3…2660, block 5, gas 29.613), verifyCertificate → Revoked. queryFilter menemukan satu event CertificateIssued dan satu CertificateRevoked untuk ID sertifikat yang sama (B-09). Hash lengkap tercantum pada Deployment_Record.pdf.</w:t>
+        <w:t>Kompilasi memakai npx hardhat compile dengan solc 0.8.24, dan 7 berkas berhasil dikompilasi. Deployment dilakukan setelah menjalankan npx hardhat node, lalu npx hardhat run scripts/deploy.js --network localhost. Jaringannya localhost dengan chain ID 31337. Contract address 0x5FbDB2315678afecb367f032d93F642f64180aa3, hash transaksi deployment 0x9845613a2f700b5d4ebe9708c6ac243b8cec9666d2a26506df2cf1d0410429de, block 1, gas 1.515.744. Deployer sekaligus admin awal adalah akun uji Hardhat #0 (B-08).</w:t>
       </w:r>
     </w:p>
     <w:p>
-      <w:pPr/>
+      <w:pPr>
+        <w:pStyle w:val="Heading3"/>
+      </w:pPr>
+      <w:r>
+        <w:rPr/>
+        <w:t>Integrasi client</w:t>
+      </w:r>
+    </w:p>
+    <w:p>
+      <w:pPr>
+        <w:spacing w:before="0" w:after="120" w:line="276" w:lineRule="auto"/>
+        <w:jc w:val="both"/>
+      </w:pPr>
       <w:r>
         <w:rPr>
-          <w:b/>
+          <w:sz w:val="22"/>
         </w:rPr>
-        <w:t xml:space="preserve">Frontend. </w:t>
+        <w:t>Skrip scripts/interact.js terhubung ke node lokal lewat provider ethers. Urutan transaksinya: depositStake (0x32eba769…05d821, block 2), approveIssuer (0xd4b290a2…3000, block 3), issueCertificate (0xeca5fb48…5013, block 4, gas 141.450), verifyCertificate yang menghasilkan Valid, revokeCertificate (0x4d2fffe3…2660, block 5, gas 29.613), lalu verifyCertificate yang menghasilkan Revoked. Pencarian log dengan queryFilter menemukan satu event CertificateIssued dan satu CertificateRevoked untuk ID yang sama (B-09). Hash lengkap ada di Deployment_Record.pdf.</w:t>
       </w:r>
+    </w:p>
+    <w:p>
+      <w:pPr>
+        <w:spacing w:before="0" w:after="120" w:line="276" w:lineRule="auto"/>
+        <w:jc w:val="both"/>
+      </w:pPr>
       <w:r>
-        <w:rPr/>
-        <w:t>frontend/index.html (ethers.js v6 lokal) menghitung hash berkas di peramban, memverifikasi sertifikat, serta menerbitkan dan mencabut melalui wallet/provider. Frontend belum diuji otomatis di peramban dengan MetaMask; jalur integrasi yang terverifikasi adalah skrip interact.js. README.md memuat langkah instalasi dan reproduksi.</w:t>
+        <w:rPr>
+          <w:sz w:val="22"/>
+        </w:rPr>
+        <w:t>Frontend ada di frontend/index.html. Halaman ini menghitung hash berkas di peramban, memverifikasi sertifikat, serta menerbitkan dan mencabut lewat wallet atau provider. Frontend belum diuji otomatis di peramban dengan MetaMask, jadi jalur integrasi yang terbukti berjalan adalah skrip interact.js. Langkah instalasi dan reproduksi ada di README.md.</w:t>
       </w:r>
     </w:p>
     <w:p>
@@ -7040,7 +7248,16 @@
     </w:p>
     <w:p>
       <w:pPr>
-        <w:spacing w:line="240" w:lineRule="auto"/>
+        <w:pStyle w:val="Heading3"/>
+      </w:pPr>
+      <w:r>
+        <w:rPr/>
+        <w:t>Threat model</w:t>
+      </w:r>
+    </w:p>
+    <w:p>
+      <w:pPr>
+        <w:spacing w:line="276" w:lineRule="auto" w:before="0" w:after="120"/>
         <w:jc w:val="both"/>
         <w:rPr>
           <w:sz w:val="24"/>
@@ -7048,8 +7265,22 @@
         </w:rPr>
       </w:pPr>
       <w:r>
-        <w:rPr/>
-        <w:t>Threat model. Aset yang dilindungi: integritas catatan sertifikat, dana stake issuer, peran ADMIN/ISSUER, dan ketersediaan verifikasi/pencabutan. Aktor: admin, issuer jujur dan jahat, holder, verifier, penyerang eksternal (EOA atau kontrak), serta block builder/MEV searcher. Trust boundary: off-chain ke on-chain (isi PDF tidak dipercaya), wallet ke kontrak, kontrak ke penerima ETH, admin ke issuer, dan mempool publik. Skenario penyalahgunaan: pengurasan stake lewat reentrancy, pencabutan sertifikat pesaing, penyerobotan hash, spam yang menggagalkan pencabutan massal, input sampah, dana terkunci karena transfer gagal, dan manipulasi waktu blok.</w:t>
+        <w:rPr>
+          <w:sz w:val="22"/>
+        </w:rPr>
+        <w:t>Aset yang dilindungi adalah integritas catatan sertifikat, dana stake issuer, peran ADMIN dan ISSUER, serta ketersediaan fungsi verifikasi dan pencabutan. Aktornya adalah admin, issuer jujur dan jahat, holder, verifier, penyerang eksternal (akun biasa atau kontrak), serta block builder yang dapat mengatur urutan transaksi.</w:t>
+      </w:r>
+    </w:p>
+    <w:p>
+      <w:pPr>
+        <w:spacing w:before="0" w:after="120" w:line="276" w:lineRule="auto"/>
+        <w:jc w:val="both"/>
+      </w:pPr>
+      <w:r>
+        <w:rPr>
+          <w:sz w:val="22"/>
+        </w:rPr>
+        <w:t>Trust boundary ada di lima titik: antara data di luar rantai dan di dalam rantai (isi PDF tidak dipercaya), antara wallet dan kontrak, antara kontrak dan penerima ETH, antara admin dan issuer, serta mempool publik. Skenario penyalahgunaan yang dipertimbangkan adalah pengurasan stake lewat reentrancy, pencabutan sertifikat pesaing, penyerobotan hash, spam yang menggagalkan pencabutan massal, input sampah, dana terkunci karena transfer gagal, dan manipulasi waktu blok.</w:t>
       </w:r>
     </w:p>
     <w:tbl>
@@ -7079,7 +7310,7 @@
           <w:p>
             <w:pPr>
               <w:spacing w:after="40"/>
-              <w:jc w:val="both"/>
+              <w:jc w:val="left"/>
               <w:rPr>
                 <w:sz w:val="24"/>
                 <w:szCs w:val="24"/>
@@ -7104,7 +7335,7 @@
           <w:p>
             <w:pPr>
               <w:spacing w:after="40"/>
-              <w:jc w:val="both"/>
+              <w:jc w:val="left"/>
               <w:rPr>
                 <w:sz w:val="24"/>
                 <w:szCs w:val="24"/>
@@ -7129,7 +7360,7 @@
           <w:p>
             <w:pPr>
               <w:spacing w:after="40"/>
-              <w:jc w:val="both"/>
+              <w:jc w:val="left"/>
               <w:rPr>
                 <w:sz w:val="24"/>
                 <w:szCs w:val="24"/>
@@ -7154,7 +7385,7 @@
           <w:p>
             <w:pPr>
               <w:spacing w:after="40"/>
-              <w:jc w:val="both"/>
+              <w:jc w:val="left"/>
               <w:rPr>
                 <w:sz w:val="24"/>
                 <w:szCs w:val="24"/>
@@ -7179,7 +7410,7 @@
           <w:p>
             <w:pPr>
               <w:spacing w:after="40"/>
-              <w:jc w:val="both"/>
+              <w:jc w:val="left"/>
               <w:rPr>
                 <w:sz w:val="24"/>
                 <w:szCs w:val="24"/>
@@ -8151,7 +8382,16 @@
     </w:tbl>
     <w:p>
       <w:pPr>
-        <w:spacing w:line="240" w:lineRule="auto"/>
+        <w:pStyle w:val="Heading3"/>
+      </w:pPr>
+      <w:r>
+        <w:rPr/>
+        <w:t>Tabel audit temuan</w:t>
+      </w:r>
+    </w:p>
+    <w:p>
+      <w:pPr>
+        <w:spacing w:line="276" w:lineRule="auto" w:before="0" w:after="120"/>
         <w:jc w:val="both"/>
         <w:rPr>
           <w:sz w:val="24"/>
@@ -8160,42 +8400,69 @@
       </w:pPr>
     </w:p>
     <w:p>
-      <w:pPr/>
-      <w:r>
-        <w:rPr>
-          <w:b/>
-        </w:rPr>
-        <w:t xml:space="preserve">Klasifikasi dan analisis statis. </w:t>
-      </w:r>
+      <w:pPr>
+        <w:pStyle w:val="Heading3"/>
+      </w:pPr>
       <w:r>
         <w:rPr/>
-        <w:t>Risiko ditentukan dari matriks dampak × kemungkinan eksploitasi: dampak tinggi dengan kemungkinan sedang/tinggi menjadi risiko tinggi (A-01, A-02); dampak tinggi dengan kemungkinan rendah menjadi sedang (A-07). Slither (102 detektor, 9 kontrak, 10 hasil) mengonfirmasi A-01 dan A-07 hanya pada V1; pada V2 hanya tersisa peringatan arbitrary-send-eth pada withdrawSlashed (diterima: khusus ADMIN, tujuan dana ditentukan tata kelola, dilindungi nonReentrant), timestamp, dan low-level-calls (B-07).</w:t>
+        <w:t>Klasifikasi dan analisis statis</w:t>
       </w:r>
     </w:p>
     <w:p>
-      <w:pPr/>
+      <w:pPr>
+        <w:spacing w:before="0" w:after="120" w:line="276" w:lineRule="auto"/>
+        <w:jc w:val="both"/>
+      </w:pPr>
       <w:r>
         <w:rPr>
-          <w:b/>
+          <w:sz w:val="22"/>
         </w:rPr>
-        <w:t xml:space="preserve">Perubahan kode. </w:t>
-      </w:r>
-      <w:r>
-        <w:rPr/>
-        <w:t>V1 → V2 (commit 1caf3a8 → 713466f): urutan efek-sebelum-interaksi dan guard pada withdrawStake; otorisasi pencabutan berbasis penerbit asli; ID terikat issuer; validasi input; batch dan paginasi; tambahan tata kelola (slash, LastAdmin, pause). Baseline V1 sengaja memuat pola kerentanan umum (vulnerable-by-design) agar efektivitas mitigasi dapat dibuktikan secara terukur melalui PoC sebelum dan retest sesudah perbaikan; laporan lengkap pada Security_Audit.pdf.</w:t>
+        <w:t>Tingkat risiko ditentukan dari dampak dan kemungkinan eksploitasi. Dampak tinggi dengan kemungkinan sedang atau tinggi dinilai berisiko tinggi (A-01, A-02), sedangkan dampak tinggi dengan kemungkinan rendah dinilai sedang (A-07). Slither menjalankan 102 detektor pada 9 kontrak dan menghasilkan 10 temuan. Temuan reentrancy-eth dan unchecked-lowlevel hanya muncul pada V1, sehingga mengonfirmasi A-01 dan A-07. Pada V2 tersisa peringatan arbitrary-send-eth pada withdrawSlashed, timestamp, dan low-level-calls (B-07). Peringatan pertama diterima karena fungsinya hanya dapat dipanggil ADMIN, tujuan dana ditentukan tata kelola, dan fungsi itu dilindungi nonReentrant.</w:t>
       </w:r>
     </w:p>
     <w:p>
-      <w:pPr/>
+      <w:pPr>
+        <w:pStyle w:val="Heading3"/>
+      </w:pPr>
+      <w:r>
+        <w:rPr/>
+        <w:t>Perubahan kode</w:t>
+      </w:r>
+    </w:p>
+    <w:p>
+      <w:pPr>
+        <w:spacing w:before="0" w:after="120" w:line="276" w:lineRule="auto"/>
+        <w:jc w:val="both"/>
+      </w:pPr>
       <w:r>
         <w:rPr>
-          <w:b/>
+          <w:sz w:val="22"/>
         </w:rPr>
-        <w:t xml:space="preserve">Batas audit. </w:t>
+        <w:t>Dari V1 ke V2 (commit 1caf3a8 ke 713466f), withdrawStake diubah agar saldo dinolkan sebelum ETH dikirim dan diberi guard reentrancy. Pencabutan sertifikat kini hanya boleh dilakukan issuer asli atau admin. ID sertifikat terikat pada issuer, input divalidasi, pencabutan massal dibatasi 50 item, dan daftar sertifikat per holder dibaca per halaman. Penulis juga menambahkan slash, perlindungan admin terakhir, dan pause.</w:t>
       </w:r>
+    </w:p>
+    <w:p>
+      <w:pPr>
+        <w:spacing w:before="0" w:after="120" w:line="276" w:lineRule="auto"/>
+        <w:jc w:val="both"/>
+      </w:pPr>
       <w:r>
-        <w:rPr/>
-        <w:t>Audit mandiri tanpa fuzzing atau verifikasi formal; invariant (mis. total stake sama dengan saldo kontrak dikurangi slashedPool) dapat diuji dengan Echidna/Foundry pada tahap lanjut. Audit profesional independen tetap disarankan sebelum penggunaan nyata.</w:t>
+        <w:rPr>
+          <w:sz w:val="22"/>
+        </w:rPr>
+        <w:t>V1 sengaja dibuat rentan (vulnerable-by-design) supaya efektivitas perbaikan dapat dibuktikan dengan PoC sebelum dan retest sesudahnya. Laporan audit lengkap ada di Security_Audit.pdf.</w:t>
+      </w:r>
+    </w:p>
+    <w:p>
+      <w:pPr>
+        <w:spacing w:before="0" w:after="120" w:line="276" w:lineRule="auto"/>
+        <w:jc w:val="both"/>
+      </w:pPr>
+      <w:r>
+        <w:rPr>
+          <w:sz w:val="22"/>
+        </w:rPr>
+        <w:t>Audit ini dilakukan sendiri tanpa fuzzing atau verifikasi formal. Invariant seperti total stake sama dengan saldo kontrak dikurangi slashedPool dapat diuji dengan Echidna atau Foundry pada tahap lanjut, dan audit independen tetap disarankan sebelum kontrak dipakai di dunia nyata.</w:t>
       </w:r>
     </w:p>
     <w:p>
@@ -8239,7 +8506,7 @@
           <w:p>
             <w:pPr>
               <w:spacing w:after="40"/>
-              <w:jc w:val="both"/>
+              <w:jc w:val="left"/>
               <w:rPr>
                 <w:sz w:val="24"/>
                 <w:szCs w:val="24"/>
@@ -8264,7 +8531,7 @@
           <w:p>
             <w:pPr>
               <w:spacing w:after="40"/>
-              <w:jc w:val="both"/>
+              <w:jc w:val="left"/>
               <w:rPr>
                 <w:sz w:val="24"/>
                 <w:szCs w:val="24"/>
@@ -8289,7 +8556,7 @@
           <w:p>
             <w:pPr>
               <w:spacing w:after="40"/>
-              <w:jc w:val="both"/>
+              <w:jc w:val="left"/>
               <w:rPr>
                 <w:sz w:val="24"/>
                 <w:szCs w:val="24"/>
@@ -8314,7 +8581,7 @@
           <w:p>
             <w:pPr>
               <w:spacing w:after="40"/>
-              <w:jc w:val="both"/>
+              <w:jc w:val="left"/>
               <w:rPr>
                 <w:sz w:val="24"/>
                 <w:szCs w:val="24"/>
@@ -8819,7 +9086,7 @@
     </w:tbl>
     <w:p>
       <w:pPr>
-        <w:spacing w:line="240" w:lineRule="auto"/>
+        <w:spacing w:line="276" w:lineRule="auto" w:before="0" w:after="120"/>
         <w:jc w:val="both"/>
         <w:rPr>
           <w:sz w:val="24"/>
@@ -8829,86 +9096,133 @@
     </w:p>
     <w:p>
       <w:pPr>
-        <w:spacing w:line="240" w:lineRule="auto"/>
-        <w:jc w:val="both"/>
-        <w:rPr>
-          <w:sz w:val="24"/>
-          <w:szCs w:val="24"/>
-        </w:rPr>
+        <w:pStyle w:val="Heading3"/>
       </w:pPr>
       <w:r>
         <w:rPr/>
-        <w:t>Skalabilitas dan bottleneck. Beban CertiChain didominasi pembacaan (verifikasi) yang bersifat gratis (eth_call) dan tidak membebani konsensus; penulisan hanya terjadi saat penerbitan atau pencabutan. Bottleneck utama: (1) biaya dan antrean transaksi bila memakai public L1 saat penerbitan massal pada musim wisuda; (2) penyimpanan array per holder yang tumbuh (dimitigasi paginasi, A-04); (3) ketersediaan penyimpanan off-chain; (4) indexer untuk pencarian yang lebih kaya daripada pembacaan per-ID. Skala dapat ditingkatkan dengan batching, penerbitan berbasis Merkle root, atau L2.</w:t>
-      </w:r>
-    </w:p>
-    <w:p>
-      <w:pPr/>
-      <w:r>
-        <w:rPr>
-          <w:b/>
-        </w:rPr>
-        <w:t xml:space="preserve">Interoperabilitas. </w:t>
-      </w:r>
-      <w:r>
-        <w:rPr/>
-        <w:t>Kontrak mengikuti standar EVM sehingga dapat dipindah ke jaringan EVM-compatible lain (publik maupun permissioned). Antar-institusi perlu kesepakatan format dokumen, algoritma hash, dan skema ID; untuk lintas chain diperlukan gateway atau anchoring, bukan bridge aset.</w:t>
-      </w:r>
-    </w:p>
-    <w:p>
-      <w:pPr/>
-      <w:r>
-        <w:rPr>
-          <w:b/>
-        </w:rPr>
-        <w:t xml:space="preserve">Privasi data. </w:t>
-      </w:r>
-      <w:r>
-        <w:rPr/>
-        <w:t>Yang tidak seharusnya terbuka di blockchain: nama, NIM/NIK, nilai, alamat, isi PDF, dan data pribadi apa pun, karena data on-chain tidak dapat dihapus dan terbuka bagi semua node; hal ini relevan dengan UU Pelindungan Data Pribadi (UU 27/2022). Hash dari data berentropi rendah dapat ditebak lewat brute force, sehingga hash sebaiknya dihitung dari dokumen yang diberi salt acak. Alamat holder bersifat pseudonim tetapi dapat ditautkan; pertimbangkan alamat per-sertifikat atau pencatatan holder dalam bentuk hash.</w:t>
-      </w:r>
-    </w:p>
-    <w:p>
-      <w:pPr/>
-      <w:r>
-        <w:rPr>
-          <w:b/>
-        </w:rPr>
-        <w:t xml:space="preserve">Tata kelola. </w:t>
-      </w:r>
-      <w:r>
-        <w:rPr/>
-        <w:t>Pada prototipe, ADMIN mengelola peran, sanksi, dan pause; perubahan kontrak berarti deploy kontrak baru karena tidak upgradeable. Rekomendasi produksi: admin berupa multisig konsorsium dengan timelock; penambahan dan penghapusan node diputuskan konsorsium; penyelesaian sengketa (mis. issuer dituduh mencabut sertifikat tanpa dasar) lewat komite etik konsorsium dengan bukti event on-chain, dan slash hanya dengan persetujuan multi-pihak.</w:t>
-      </w:r>
-    </w:p>
-    <w:p>
-      <w:pPr/>
-      <w:r>
-        <w:rPr>
-          <w:b/>
-        </w:rPr>
-        <w:t xml:space="preserve">Kapan pilihan lain lebih tepat. </w:t>
-      </w:r>
-      <w:r>
-        <w:rPr/>
-        <w:t>Public blockchain tepat bila verifikasi harus netral tanpa operator tepercaya, peserta tidak dapat dikenal, dan data benar-benar publik. Permissioned/konsorsium tepat bila peserta dikenal, privasi dan governance formal dibutuhkan, dan biaya harus terprediksi. Database tradisional dengan tanda tangan digital dan PKI lebih tepat bila hanya satu institusi penerbit yang dipercaya, tidak ada kebutuhan jejak lintas pihak, atau kebutuhan penghapusan data kuat; blockchain tidak menambah nilai pada kondisi itu.</w:t>
-      </w:r>
-    </w:p>
-    <w:p>
-      <w:pPr/>
-      <w:r>
-        <w:rPr>
-          <w:b/>
-        </w:rPr>
-        <w:t xml:space="preserve">Rekomendasi arsitektur akhir. </w:t>
-      </w:r>
-      <w:r>
-        <w:rPr/>
-        <w:t>Gunakan blockchain permissioned/konsorsium berbasis EVM (mis. Hyperledger Besu dengan QBFT) yang dioperasikan oleh konsorsium institusi penerbit, kontrak tetap Solidity, hanya hash dengan salt yang dicatat on-chain, berkas disimpan off-chain terenkripsi, serta gateway verifikasi publik read-only; opsional menjangkarkan Merkle root berkala ke public chain untuk transparansi tambahan. Alasan: issuer dikenal, privasi dan governance formal diperlukan, biaya terprediksi, dan kode serta pengujian prototipe dapat dipakai ulang. Perbandingan di atas bersifat analisis kualitatif; angka throughput dan biaya perlu diukur pada lingkungan konsorsium sebenarnya.</w:t>
+        <w:t>Skalabilitas dan bottleneck</w:t>
       </w:r>
     </w:p>
     <w:p>
       <w:pPr>
-        <w:spacing w:line="240" w:lineRule="auto"/>
+        <w:spacing w:before="0" w:after="120" w:line="276" w:lineRule="auto"/>
+        <w:jc w:val="both"/>
+      </w:pPr>
+      <w:r>
+        <w:rPr>
+          <w:sz w:val="22"/>
+        </w:rPr>
+        <w:t>Beban CertiChain didominasi pembacaan untuk verifikasi, yang gratis karena memakai eth_call dan tidak membebani konsensus. Penulisan hanya terjadi saat penerbitan dan pencabutan. Bottleneck utamanya ada empat: antrean dan biaya transaksi di public L1 ketika penerbitan massal, misalnya saat wisuda; array sertifikat per holder yang terus tumbuh (diatasi dengan paginasi, A-04); ketersediaan penyimpanan di luar rantai; dan kebutuhan indexer untuk pencarian yang lebih kaya daripada pembacaan per ID. Kapasitas dapat dinaikkan dengan batching, penerbitan lewat Merkle root, atau L2.</w:t>
+      </w:r>
+    </w:p>
+    <w:p>
+      <w:pPr>
+        <w:pStyle w:val="Heading3"/>
+      </w:pPr>
+      <w:r>
+        <w:rPr/>
+        <w:t>Interoperabilitas</w:t>
+      </w:r>
+    </w:p>
+    <w:p>
+      <w:pPr>
+        <w:spacing w:before="0" w:after="120" w:line="276" w:lineRule="auto"/>
+        <w:jc w:val="both"/>
+      </w:pPr>
+      <w:r>
+        <w:rPr>
+          <w:sz w:val="22"/>
+        </w:rPr>
+        <w:t>Kontrak mengikuti standar EVM sehingga dapat dipindahkan ke jaringan EVM lain, publik maupun permissioned. Antarinstitusi perlu menyepakati format dokumen, algoritma hash, dan skema ID. Untuk lintas chain, gateway atau anchoring lebih tepat daripada bridge aset.</w:t>
+      </w:r>
+    </w:p>
+    <w:p>
+      <w:pPr>
+        <w:pStyle w:val="Heading3"/>
+      </w:pPr>
+      <w:r>
+        <w:rPr/>
+        <w:t>Privasi data</w:t>
+      </w:r>
+    </w:p>
+    <w:p>
+      <w:pPr>
+        <w:spacing w:before="0" w:after="120" w:line="276" w:lineRule="auto"/>
+        <w:jc w:val="both"/>
+      </w:pPr>
+      <w:r>
+        <w:rPr>
+          <w:sz w:val="22"/>
+        </w:rPr>
+        <w:t>Nama, NIM atau NIK, nilai, alamat, isi PDF, dan data pribadi lain tidak boleh diletakkan di blockchain. Data on-chain tidak dapat dihapus dan terbuka bagi semua node, padahal UU Pelindungan Data Pribadi (UU 27/2022) mengatur hak subjek data. Hash dari data yang mudah ditebak dapat dibongkar dengan brute force, sehingga hash sebaiknya dihitung dari dokumen yang diberi salt acak. Alamat holder bersifat pseudonim tetapi dapat ditautkan, jadi alamat per sertifikat atau pencatatan holder dalam bentuk hash patut dipertimbangkan.</w:t>
+      </w:r>
+    </w:p>
+    <w:p>
+      <w:pPr>
+        <w:pStyle w:val="Heading3"/>
+      </w:pPr>
+      <w:r>
+        <w:rPr/>
+        <w:t>Tata kelola</w:t>
+      </w:r>
+    </w:p>
+    <w:p>
+      <w:pPr>
+        <w:spacing w:before="0" w:after="120" w:line="276" w:lineRule="auto"/>
+        <w:jc w:val="both"/>
+      </w:pPr>
+      <w:r>
+        <w:rPr>
+          <w:sz w:val="22"/>
+        </w:rPr>
+        <w:t>Pada prototipe, admin mengelola peran, sanksi, dan pause. Mengubah kontrak berarti deploy kontrak baru karena kontrak tidak dapat di-upgrade. Untuk produksi, admin sebaiknya berupa multisig konsorsium dengan timelock, sementara penambahan dan penghapusan node diputuskan konsorsium. Sengketa, misalnya issuer yang dituduh mencabut sertifikat tanpa dasar, diselesaikan komite konsorsium dengan bukti event on-chain, dan slash hanya dijalankan dengan persetujuan beberapa pihak.</w:t>
+      </w:r>
+    </w:p>
+    <w:p>
+      <w:pPr>
+        <w:pStyle w:val="Heading3"/>
+      </w:pPr>
+      <w:r>
+        <w:rPr/>
+        <w:t>Kapan pilihan lain lebih tepat</w:t>
+      </w:r>
+    </w:p>
+    <w:p>
+      <w:pPr>
+        <w:spacing w:before="0" w:after="120" w:line="276" w:lineRule="auto"/>
+        <w:jc w:val="both"/>
+      </w:pPr>
+      <w:r>
+        <w:rPr>
+          <w:sz w:val="22"/>
+        </w:rPr>
+        <w:t>Public blockchain cocok bila verifikasi harus netral tanpa operator tepercaya, pesertanya tidak dikenal, dan datanya memang publik. Blockchain permissioned cocok bila pesertanya dikenal, privasi dan tata kelola formal dibutuhkan, dan biaya harus bisa diperkirakan. Database tradisional dengan tanda tangan digital lebih tepat bila hanya ada satu penerbit tepercaya, tidak perlu jejak lintas pihak, atau data harus bisa dihapus. Pada kondisi itu blockchain tidak menambah nilai.</w:t>
+      </w:r>
+    </w:p>
+    <w:p>
+      <w:pPr>
+        <w:pStyle w:val="Heading3"/>
+      </w:pPr>
+      <w:r>
+        <w:rPr/>
+        <w:t>Rekomendasi arsitektur akhir</w:t>
+      </w:r>
+    </w:p>
+    <w:p>
+      <w:pPr>
+        <w:spacing w:before="0" w:after="120" w:line="276" w:lineRule="auto"/>
+        <w:jc w:val="both"/>
+      </w:pPr>
+      <w:r>
+        <w:rPr>
+          <w:sz w:val="22"/>
+        </w:rPr>
+        <w:t>Penulis merekomendasikan blockchain permissioned berbasis EVM, misalnya Hyperledger Besu dengan QBFT, yang dioperasikan konsorsium institusi penerbit. Kontrak tetap Solidity, hanya hash bersalt yang dicatat on-chain, berkas disimpan terenkripsi di luar rantai, dan verifikasi publik disediakan lewat gateway read-only. Merkle root dapat dijangkarkan berkala ke public chain bila perlu transparansi tambahan. Alasannya, penerbit dikenal, privasi dan tata kelola formal dibutuhkan, biaya lebih mudah diperkirakan, dan kode serta tes prototipe dapat dipakai ulang. Perbandingan ini bersifat kualitatif, sehingga angka throughput dan biaya masih perlu diukur di lingkungan konsorsium yang sebenarnya.</w:t>
+      </w:r>
+    </w:p>
+    <w:p>
+      <w:pPr>
+        <w:spacing w:line="276" w:lineRule="auto" w:before="0" w:after="120"/>
         <w:jc w:val="both"/>
         <w:rPr>
           <w:sz w:val="24"/>
@@ -8917,7 +9231,7 @@
       </w:pPr>
       <w:r>
         <w:rPr>
-          <w:sz w:val="24"/>
+          <w:sz w:val="22"/>
           <w:szCs w:val="24"/>
         </w:rPr>
         <w:br w:type="page"/>
@@ -8940,7 +9254,7 @@
     </w:p>
     <w:p>
       <w:pPr>
-        <w:spacing w:line="240" w:lineRule="auto"/>
+        <w:spacing w:line="276" w:lineRule="auto" w:before="0" w:after="120"/>
         <w:jc w:val="both"/>
         <w:rPr>
           <w:sz w:val="24"/>
@@ -8948,34 +9262,130 @@
         </w:rPr>
       </w:pPr>
       <w:r>
-        <w:rPr/>
-        <w:t>Alur demo end-to-end: jalankan Hardhat node; deploy kontrak dan catat address serta tx hash; stake dan approve issuer; terbitkan sertifikat dari hash dokumen; verifikasi (Valid); cabut; verifikasi ulang (Revoked); tunjukkan event pada log; tampilkan 37 tes lulus, coverage, PoC V1 dan retest V2. Presentasi maksimal 10 slide (Slide_Presentasi.pptx, 7 slide). Video cadangan dibuat tim berdasarkan docs/Skenario_Video_Demo.md.</w:t>
+        <w:rPr>
+          <w:sz w:val="22"/>
+        </w:rPr>
+        <w:t>Demo berjalan dengan urutan berikut: menjalankan Hardhat node, deploy kontrak dan mencatat address serta hash transaksi, stake dan approve issuer, menerbitkan sertifikat dari hash dokumen, verifikasi (Valid), pencabutan, verifikasi ulang (Revoked), lalu menampilkan event di log. Setelah itu ditunjukkan 37 tes lulus, coverage, PoC pada V1, dan retest pada V2. Presentasi terdiri dari 7 slide (Slide_Presentasi.pptx), dan skenario video cadangan ada di docs/Skenario_Video_Demo.md.</w:t>
       </w:r>
     </w:p>
     <w:p>
-      <w:pPr/>
-      <w:r>
-        <w:rPr>
-          <w:b/>
-        </w:rPr>
-        <w:t xml:space="preserve">Batasan dan etika/regulasi. </w:t>
-      </w:r>
+      <w:pPr>
+        <w:pStyle w:val="Heading3"/>
+      </w:pPr>
       <w:r>
         <w:rPr/>
-        <w:t>Prototipe hanya berjalan di local network dengan data simulasi. Pada penggunaan nyata perlu dipertimbangkan UU Pelindungan Data Pribadi (UU 27/2022), ketentuan tanda tangan/sertifikat elektronik (UU ITE dan PP 71/2019) serta aturan penerbitan ijazah dari kementerian terkait, yang harus dikonfirmasi ulang pada sumber resmi. Risiko lain: kunci issuer bocor, tata kelola terpusat pada admin, dan ketidaksetaraan akses bagi institusi kecil. Dampak positif: verifikasi cepat dan murah serta berkurangnya pemalsuan; keberlanjutan menuntut operasi node konsorsium, rotasi kunci, dan prosedur pencabutan yang adil.</w:t>
+        <w:t>Etika, regulasi, dan dampak</w:t>
       </w:r>
     </w:p>
     <w:p>
-      <w:pPr/>
+      <w:pPr>
+        <w:spacing w:before="0" w:after="120" w:line="276" w:lineRule="auto"/>
+        <w:jc w:val="both"/>
+      </w:pPr>
       <w:r>
         <w:rPr>
-          <w:b/>
+          <w:sz w:val="22"/>
         </w:rPr>
-        <w:t xml:space="preserve">Roadmap perbaikan yang realistis. </w:t>
+        <w:t>Prototipe hanya berjalan di local network dengan data simulasi. Bila dipakai di dunia nyata, perlu dipertimbangkan UU Pelindungan Data Pribadi (UU 27/2022), aturan tanda tangan dan sertifikat elektronik (UU ITE dan PP 71/2019), serta ketentuan penerbitan ijazah dari kementerian terkait. Ketentuan ini perlu dicek ulang ke sumber resminya.</w:t>
       </w:r>
+    </w:p>
+    <w:p>
+      <w:pPr>
+        <w:spacing w:before="0" w:after="120" w:line="276" w:lineRule="auto"/>
+        <w:jc w:val="both"/>
+      </w:pPr>
+      <w:r>
+        <w:rPr>
+          <w:sz w:val="22"/>
+        </w:rPr>
+        <w:t>Risiko yang ada adalah kunci issuer bocor, tata kelola yang terpusat pada admin, dan institusi kecil yang kesulitan ikut serta. Manfaatnya adalah verifikasi yang cepat dan murah serta berkurangnya pemalsuan. Agar berkelanjutan, diperlukan operasi node konsorsium, rotasi kunci, dan prosedur pencabutan yang adil.</w:t>
+      </w:r>
+    </w:p>
+    <w:p>
+      <w:pPr>
+        <w:pStyle w:val="Heading3"/>
+      </w:pPr>
       <w:r>
         <w:rPr/>
-        <w:t>(1) Admin multisig dan timelock; (2) fuzzing/invariant testing (Echidna/Foundry) dan audit eksternal; (3) uji frontend otomatis dengan Playwright dan wallet uji; (4) hash dengan salt serta penyimpanan terenkripsi (IPFS/S3); (5) migrasi ke jaringan konsorsium EVM (Besu) dan uji beban; (6) indexer (mis. subgraph) untuk pencarian; (7) integrasi identitas issuer (DID/PKI) dan kebijakan pencabutan berjenjang.</w:t>
+        <w:t>Roadmap perbaikan</w:t>
+      </w:r>
+    </w:p>
+    <w:p>
+      <w:pPr>
+        <w:pStyle w:val="ListBullet"/>
+        <w:spacing w:before="0" w:after="60" w:line="276" w:lineRule="auto"/>
+        <w:jc w:val="left"/>
+      </w:pPr>
+      <w:r>
+        <w:rPr>
+          <w:sz w:val="22"/>
+        </w:rPr>
+        <w:t>Admin berupa multisig dengan timelock.</w:t>
+      </w:r>
+    </w:p>
+    <w:p>
+      <w:pPr>
+        <w:pStyle w:val="ListBullet"/>
+        <w:spacing w:before="0" w:after="60" w:line="276" w:lineRule="auto"/>
+        <w:jc w:val="left"/>
+      </w:pPr>
+      <w:r>
+        <w:rPr>
+          <w:sz w:val="22"/>
+        </w:rPr>
+        <w:t>Fuzzing, invariant testing, dan audit eksternal.</w:t>
+      </w:r>
+    </w:p>
+    <w:p>
+      <w:pPr>
+        <w:pStyle w:val="ListBullet"/>
+        <w:spacing w:before="0" w:after="60" w:line="276" w:lineRule="auto"/>
+        <w:jc w:val="left"/>
+      </w:pPr>
+      <w:r>
+        <w:rPr>
+          <w:sz w:val="22"/>
+        </w:rPr>
+        <w:t>Pengujian otomatis untuk frontend.</w:t>
+      </w:r>
+    </w:p>
+    <w:p>
+      <w:pPr>
+        <w:pStyle w:val="ListBullet"/>
+        <w:spacing w:before="0" w:after="60" w:line="276" w:lineRule="auto"/>
+        <w:jc w:val="left"/>
+      </w:pPr>
+      <w:r>
+        <w:rPr>
+          <w:sz w:val="22"/>
+        </w:rPr>
+        <w:t>Hash bersalt dan penyimpanan terenkripsi di luar rantai.</w:t>
+      </w:r>
+    </w:p>
+    <w:p>
+      <w:pPr>
+        <w:pStyle w:val="ListBullet"/>
+        <w:spacing w:before="0" w:after="60" w:line="276" w:lineRule="auto"/>
+        <w:jc w:val="left"/>
+      </w:pPr>
+      <w:r>
+        <w:rPr>
+          <w:sz w:val="22"/>
+        </w:rPr>
+        <w:t>Migrasi ke jaringan konsorsium EVM disertai uji beban.</w:t>
+      </w:r>
+    </w:p>
+    <w:p>
+      <w:pPr>
+        <w:pStyle w:val="ListBullet"/>
+        <w:spacing w:before="0" w:after="60" w:line="276" w:lineRule="auto"/>
+        <w:jc w:val="left"/>
+      </w:pPr>
+      <w:r>
+        <w:rPr>
+          <w:sz w:val="22"/>
+        </w:rPr>
+        <w:t>Indexer untuk pencarian dan integrasi identitas issuer (DID atau PKI).</w:t>
       </w:r>
     </w:p>
     <w:tbl>
@@ -8985,10 +9395,10 @@
         <w:tblLook w:val="04A0" w:firstRow="1" w:lastRow="0" w:firstColumn="1" w:lastColumn="0" w:noHBand="0" w:noVBand="1"/>
       </w:tblPr>
       <w:tblGrid>
-        <w:gridCol w:w="2160"/>
-        <w:gridCol w:w="2880"/>
+        <w:gridCol w:w="2015"/>
+        <w:gridCol w:w="3456"/>
         <w:gridCol w:w="2448"/>
-        <w:gridCol w:w="2160"/>
+        <w:gridCol w:w="1728"/>
       </w:tblGrid>
       <w:tr>
         <w:trPr>
@@ -8997,14 +9407,14 @@
         </w:trPr>
         <w:tc>
           <w:tcPr>
-            <w:tcW w:w="2160" w:type="dxa"/>
+            <w:tcW w:w="2016" w:type="dxa"/>
             <w:shd w:val="clear" w:color="auto" w:fill="E9EEF4"/>
             <w:vAlign w:val="center"/>
           </w:tcPr>
           <w:p>
             <w:pPr>
               <w:spacing w:after="40"/>
-              <w:jc w:val="both"/>
+              <w:jc w:val="left"/>
               <w:rPr>
                 <w:sz w:val="24"/>
                 <w:szCs w:val="24"/>
@@ -9022,14 +9432,14 @@
         </w:tc>
         <w:tc>
           <w:tcPr>
-            <w:tcW w:w="2880" w:type="dxa"/>
+            <w:tcW w:w="3456" w:type="dxa"/>
             <w:shd w:val="clear" w:color="auto" w:fill="E9EEF4"/>
             <w:vAlign w:val="center"/>
           </w:tcPr>
           <w:p>
             <w:pPr>
               <w:spacing w:after="40"/>
-              <w:jc w:val="both"/>
+              <w:jc w:val="left"/>
               <w:rPr>
                 <w:sz w:val="24"/>
                 <w:szCs w:val="24"/>
@@ -9054,7 +9464,7 @@
           <w:p>
             <w:pPr>
               <w:spacing w:after="40"/>
-              <w:jc w:val="both"/>
+              <w:jc w:val="left"/>
               <w:rPr>
                 <w:sz w:val="24"/>
                 <w:szCs w:val="24"/>
@@ -9072,14 +9482,14 @@
         </w:tc>
         <w:tc>
           <w:tcPr>
-            <w:tcW w:w="2160" w:type="dxa"/>
+            <w:tcW w:w="1728" w:type="dxa"/>
             <w:shd w:val="clear" w:color="auto" w:fill="E9EEF4"/>
             <w:vAlign w:val="center"/>
           </w:tcPr>
           <w:p>
             <w:pPr>
               <w:spacing w:after="40"/>
-              <w:jc w:val="both"/>
+              <w:jc w:val="left"/>
               <w:rPr>
                 <w:sz w:val="24"/>
                 <w:szCs w:val="24"/>
@@ -9102,7 +9512,7 @@
         </w:trPr>
         <w:tc>
           <w:tcPr>
-            <w:tcW w:w="2160" w:type="dxa"/>
+            <w:tcW w:w="2016" w:type="dxa"/>
             <w:vAlign w:val="center"/>
           </w:tcPr>
           <w:p>
@@ -9120,13 +9530,36 @@
                 <w:szCs w:val="24"/>
                 <w:highlight w:val="yellow"/>
               </w:rPr>
-              <w:t>[Isi nama anggota 1]</w:t>
-            </w:r>
-          </w:p>
-        </w:tc>
-        <w:tc>
-          <w:tcPr>
-            <w:tcW w:w="2880" w:type="dxa"/>
+              <w:t>[Isi nama]</w:t>
+            </w:r>
+          </w:p>
+        </w:tc>
+        <w:tc>
+          <w:tcPr>
+            <w:tcW w:w="3456" w:type="dxa"/>
+            <w:vAlign w:val="center"/>
+          </w:tcPr>
+          <w:p>
+            <w:pPr>
+              <w:spacing w:after="40"/>
+              <w:jc w:val="left"/>
+              <w:rPr>
+                <w:sz w:val="24"/>
+                <w:szCs w:val="24"/>
+              </w:rPr>
+            </w:pPr>
+            <w:r>
+              <w:rPr>
+                <w:sz w:val="24"/>
+                <w:szCs w:val="24"/>
+              </w:rPr>
+              <w:t>Dikerjakan individu: desain, kontrak, pengujian, audit, deployment, dan dokumentasi</w:t>
+            </w:r>
+          </w:p>
+        </w:tc>
+        <w:tc>
+          <w:tcPr>
+            <w:tcW w:w="2448" w:type="dxa"/>
             <w:vAlign w:val="center"/>
           </w:tcPr>
           <w:p>
@@ -9144,257 +9577,30 @@
                 <w:szCs w:val="24"/>
                 <w:highlight w:val="yellow"/>
               </w:rPr>
-              <w:t>[Isi tugas/kontribusi]</w:t>
-            </w:r>
-          </w:p>
-        </w:tc>
-        <w:tc>
-          <w:tcPr>
-            <w:tcW w:w="2448" w:type="dxa"/>
-            <w:vAlign w:val="center"/>
-          </w:tcPr>
-          <w:p>
-            <w:pPr>
-              <w:spacing w:after="40"/>
-              <w:jc w:val="left"/>
-              <w:rPr>
-                <w:sz w:val="24"/>
-                <w:szCs w:val="24"/>
-              </w:rPr>
-            </w:pPr>
-            <w:r>
-              <w:rPr>
-                <w:sz w:val="24"/>
-                <w:szCs w:val="24"/>
-                <w:highlight w:val="yellow"/>
-              </w:rPr>
-              <w:t>[Isi commit/bukti dari git log]</w:t>
-            </w:r>
-          </w:p>
-        </w:tc>
-        <w:tc>
-          <w:tcPr>
-            <w:tcW w:w="2160" w:type="dxa"/>
-            <w:vAlign w:val="center"/>
-          </w:tcPr>
-          <w:p>
-            <w:pPr>
-              <w:spacing w:after="40"/>
-              <w:jc w:val="left"/>
-              <w:rPr>
-                <w:sz w:val="24"/>
-                <w:szCs w:val="24"/>
-              </w:rPr>
-            </w:pPr>
-            <w:r>
-              <w:rPr>
-                <w:sz w:val="24"/>
-                <w:szCs w:val="24"/>
-                <w:highlight w:val="yellow"/>
-              </w:rPr>
-              <w:t>[Isi bagian presentasi]</w:t>
-            </w:r>
-          </w:p>
-        </w:tc>
-      </w:tr>
-      <w:tr>
-        <w:trPr>
-          <w:cantSplit/>
-        </w:trPr>
-        <w:tc>
-          <w:tcPr>
-            <w:tcW w:w="2160" w:type="dxa"/>
-            <w:vAlign w:val="center"/>
-          </w:tcPr>
-          <w:p>
-            <w:pPr>
-              <w:spacing w:after="40"/>
-              <w:jc w:val="left"/>
-              <w:rPr>
-                <w:sz w:val="24"/>
-                <w:szCs w:val="24"/>
-              </w:rPr>
-            </w:pPr>
-            <w:r>
-              <w:rPr>
-                <w:sz w:val="24"/>
-                <w:szCs w:val="24"/>
-                <w:highlight w:val="yellow"/>
-              </w:rPr>
-              <w:t>[Isi nama anggota 2]</w:t>
-            </w:r>
-          </w:p>
-        </w:tc>
-        <w:tc>
-          <w:tcPr>
-            <w:tcW w:w="2880" w:type="dxa"/>
-            <w:vAlign w:val="center"/>
-          </w:tcPr>
-          <w:p>
-            <w:pPr>
-              <w:spacing w:after="40"/>
-              <w:jc w:val="left"/>
-              <w:rPr>
-                <w:sz w:val="24"/>
-                <w:szCs w:val="24"/>
-              </w:rPr>
-            </w:pPr>
-            <w:r>
-              <w:rPr>
-                <w:sz w:val="24"/>
-                <w:szCs w:val="24"/>
-                <w:highlight w:val="yellow"/>
-              </w:rPr>
-              <w:t>[Isi tugas/kontribusi]</w:t>
-            </w:r>
-          </w:p>
-        </w:tc>
-        <w:tc>
-          <w:tcPr>
-            <w:tcW w:w="2448" w:type="dxa"/>
-            <w:vAlign w:val="center"/>
-          </w:tcPr>
-          <w:p>
-            <w:pPr>
-              <w:spacing w:after="40"/>
-              <w:jc w:val="left"/>
-              <w:rPr>
-                <w:sz w:val="24"/>
-                <w:szCs w:val="24"/>
-              </w:rPr>
-            </w:pPr>
-            <w:r>
-              <w:rPr>
-                <w:sz w:val="24"/>
-                <w:szCs w:val="24"/>
-                <w:highlight w:val="yellow"/>
-              </w:rPr>
-              <w:t>[Isi commit/bukti dari git log]</w:t>
-            </w:r>
-          </w:p>
-        </w:tc>
-        <w:tc>
-          <w:tcPr>
-            <w:tcW w:w="2160" w:type="dxa"/>
-            <w:vAlign w:val="center"/>
-          </w:tcPr>
-          <w:p>
-            <w:pPr>
-              <w:spacing w:after="40"/>
-              <w:jc w:val="left"/>
-              <w:rPr>
-                <w:sz w:val="24"/>
-                <w:szCs w:val="24"/>
-              </w:rPr>
-            </w:pPr>
-            <w:r>
-              <w:rPr>
-                <w:sz w:val="24"/>
-                <w:szCs w:val="24"/>
-                <w:highlight w:val="yellow"/>
-              </w:rPr>
-              <w:t>[Isi bagian presentasi]</w:t>
-            </w:r>
-          </w:p>
-        </w:tc>
-      </w:tr>
-      <w:tr>
-        <w:trPr>
-          <w:cantSplit/>
-        </w:trPr>
-        <w:tc>
-          <w:tcPr>
-            <w:tcW w:w="2160" w:type="dxa"/>
-            <w:vAlign w:val="center"/>
-          </w:tcPr>
-          <w:p>
-            <w:pPr>
-              <w:spacing w:after="40"/>
-              <w:jc w:val="left"/>
-              <w:rPr>
-                <w:sz w:val="24"/>
-                <w:szCs w:val="24"/>
-              </w:rPr>
-            </w:pPr>
-            <w:r>
-              <w:rPr>
-                <w:sz w:val="24"/>
-                <w:szCs w:val="24"/>
-                <w:highlight w:val="yellow"/>
-              </w:rPr>
-              <w:t>[Isi nama anggota 3]</w:t>
-            </w:r>
-          </w:p>
-        </w:tc>
-        <w:tc>
-          <w:tcPr>
-            <w:tcW w:w="2880" w:type="dxa"/>
-            <w:vAlign w:val="center"/>
-          </w:tcPr>
-          <w:p>
-            <w:pPr>
-              <w:spacing w:after="40"/>
-              <w:jc w:val="left"/>
-              <w:rPr>
-                <w:sz w:val="24"/>
-                <w:szCs w:val="24"/>
-              </w:rPr>
-            </w:pPr>
-            <w:r>
-              <w:rPr>
-                <w:sz w:val="24"/>
-                <w:szCs w:val="24"/>
-                <w:highlight w:val="yellow"/>
-              </w:rPr>
-              <w:t>[Isi tugas/kontribusi]</w:t>
-            </w:r>
-          </w:p>
-        </w:tc>
-        <w:tc>
-          <w:tcPr>
-            <w:tcW w:w="2448" w:type="dxa"/>
-            <w:vAlign w:val="center"/>
-          </w:tcPr>
-          <w:p>
-            <w:pPr>
-              <w:spacing w:after="40"/>
-              <w:jc w:val="left"/>
-              <w:rPr>
-                <w:sz w:val="24"/>
-                <w:szCs w:val="24"/>
-              </w:rPr>
-            </w:pPr>
-            <w:r>
-              <w:rPr>
-                <w:sz w:val="24"/>
-                <w:szCs w:val="24"/>
-                <w:highlight w:val="yellow"/>
-              </w:rPr>
-              <w:t>[Isi commit/bukti dari git log]</w:t>
-            </w:r>
-          </w:p>
-        </w:tc>
-        <w:tc>
-          <w:tcPr>
-            <w:tcW w:w="2160" w:type="dxa"/>
-            <w:vAlign w:val="center"/>
-          </w:tcPr>
-          <w:p>
-            <w:pPr>
-              <w:spacing w:after="40"/>
-              <w:jc w:val="left"/>
-              <w:rPr>
-                <w:sz w:val="24"/>
-                <w:szCs w:val="24"/>
-              </w:rPr>
-            </w:pPr>
-            <w:r>
-              <w:rPr>
-                <w:sz w:val="24"/>
-                <w:szCs w:val="24"/>
-                <w:highlight w:val="yellow"/>
-              </w:rPr>
-              <w:t>[Isi bagian presentasi]</w:t>
+              <w:t>[Isi commit dari git log repositori]</w:t>
+            </w:r>
+          </w:p>
+        </w:tc>
+        <w:tc>
+          <w:tcPr>
+            <w:tcW w:w="1728" w:type="dxa"/>
+            <w:vAlign w:val="center"/>
+          </w:tcPr>
+          <w:p>
+            <w:pPr>
+              <w:spacing w:after="40"/>
+              <w:jc w:val="left"/>
+              <w:rPr>
+                <w:sz w:val="24"/>
+                <w:szCs w:val="24"/>
+              </w:rPr>
+            </w:pPr>
+            <w:r>
+              <w:rPr>
+                <w:sz w:val="24"/>
+                <w:szCs w:val="24"/>
+              </w:rPr>
+              <w:t>Seluruh slide</w:t>
             </w:r>
           </w:p>
         </w:tc>
@@ -9402,7 +9608,7 @@
     </w:tbl>
     <w:p>
       <w:pPr>
-        <w:spacing w:line="240" w:lineRule="auto"/>
+        <w:spacing w:line="276" w:lineRule="auto" w:before="0" w:after="120"/>
         <w:jc w:val="both"/>
         <w:rPr>
           <w:sz w:val="24"/>
@@ -9411,12 +9617,15 @@
       </w:pPr>
     </w:p>
     <w:p>
-      <w:pPr/>
+      <w:pPr>
+        <w:spacing w:before="0" w:after="120" w:line="276" w:lineRule="auto"/>
+        <w:jc w:val="both"/>
+      </w:pPr>
       <w:r>
         <w:rPr>
-          <w:i/>
+          <w:sz w:val="22"/>
         </w:rPr>
-        <w:t>Tabel kontribusi harus diisi sesuai riwayat commit nyata masing-masing anggota; riwayat commit pada paket ini (akun Tim UAS Blockchain) adalah riwayat kerja bersama dan perlu digantikan oleh repositori tim yang asli. Setiap anggota wajib memahami seluruh sistem dan dapat menjelaskan bagian mana pun saat defense.</w:t>
+        <w:t>UAS ini dikerjakan secara individu, sehingga seluruh bagian menjadi tanggung jawab penulis.</w:t>
       </w:r>
     </w:p>
     <w:p>
@@ -9436,7 +9645,7 @@
     </w:p>
     <w:p>
       <w:pPr>
-        <w:spacing w:line="240" w:lineRule="auto"/>
+        <w:spacing w:line="276" w:lineRule="auto" w:before="0" w:after="120"/>
         <w:jc w:val="both"/>
         <w:rPr>
           <w:sz w:val="24"/>
@@ -9444,22 +9653,22 @@
         </w:rPr>
       </w:pPr>
       <w:r>
-        <w:rPr/>
-      </w:r>
-      <w:r>
         <w:rPr>
           <w:b/>
+          <w:sz w:val="22"/>
         </w:rPr>
         <w:t xml:space="preserve">Kesimpulan: </w:t>
       </w:r>
       <w:r>
-        <w:rPr/>
-        <w:t>Pertanyaan utama UAS terjawab sebagian besar secara teknis pada skala prototipe: kontrak CertiChain v2 layak (alur end-to-end berjalan), teruji (37 tes lulus; coverage fungsi inti 100 %), dapat direproduksi (README dan skrip), dan aman terhadap tujuh temuan yang diaudit (enam diperbaiki dan terverifikasi lewat PoC dan retest, satu informasional). Terbukti: perilaku kontrak pada local network, mitigasi reentrancy, access control, ordering, DoS, validasi input, dan error handling. Masih terbatas: audit mandiri tanpa fuzzing atau pihak independen, admin tunggal, frontend belum diuji otomatis, dan use case/data simulasi. Tindak lanjut realistis: multisig + timelock, fuzzing, audit eksternal, dan migrasi ke jaringan konsorsium EVM sesuai rekomendasi arsitektur.</w:t>
+        <w:rPr>
+          <w:sz w:val="22"/>
+        </w:rPr>
+        <w:t>Kontrak CertiChain v2 layak sebagai prototipe. Alur dari stake sampai pencabutan berjalan di local network, 37 tes lulus, dan coverage fungsi inti mencapai 100%. Dari tujuh temuan audit, enam diperbaiki dan terbukti lewat PoC dan retest, sedangkan satu bersifat informasional. Yang sudah terbukti adalah perilaku kontrak di local network serta mitigasi terhadap reentrancy, kelemahan access control, urutan transaksi, DoS, validasi input, dan error handling. Yang masih terbatas adalah audit yang dilakukan sendiri tanpa fuzzing, admin tunggal, frontend yang belum diuji otomatis, dan data yang hanya simulasi. Tindak lanjut yang realistis adalah multisig dengan timelock, fuzzing, audit eksternal, dan migrasi ke jaringan konsorsium EVM sesuai rekomendasi.</w:t>
       </w:r>
     </w:p>
     <w:p>
       <w:pPr>
-        <w:spacing w:line="240" w:lineRule="auto"/>
+        <w:spacing w:line="276" w:lineRule="auto" w:before="0" w:after="120"/>
         <w:jc w:val="both"/>
         <w:rPr>
           <w:sz w:val="24"/>
@@ -9467,22 +9676,160 @@
         </w:rPr>
       </w:pPr>
       <w:r>
-        <w:rPr/>
-      </w:r>
-      <w:r>
         <w:rPr>
           <w:b/>
+          <w:sz w:val="22"/>
         </w:rPr>
-        <w:t xml:space="preserve">Daftar pustaka: </w:t>
-      </w:r>
-      <w:r>
-        <w:rPr/>
-        <w:t>Solidity Documentation, docs.soliditylang.org (diakses Oktober 2026). Hardhat Documentation, hardhat.org. ethers.js v6 Documentation, docs.ethers.org/v6. Ethereum.org Developer Documentation. OpenZeppelin Contracts Documentation (rujukan pola ReentrancyGuard dan AccessControl). Smart Contract Weakness Classification Registry (SWC), swcregistry.io. Feist, J., Grieco, G., Groce, A. (2019). Slither: A Static Analysis Framework for Smart Contracts. WETSEB. Hyperledger Fabric Documentation, hyperledger-fabric.readthedocs.io. Hyperledger Besu Documentation. Antonopoulos, A. M. dan Wood, G. (2018). Mastering Ethereum. O'Reilly. Undang-Undang No. 27 Tahun 2022 tentang Pelindungan Data Pribadi. Materi kuliah Blockchain, Universitas Siliwangi, TA 2026/2027. Seluruh kode kontrak ditulis oleh tim; tidak ada kode pihak lain yang disalin.</w:t>
+        <w:t>Daftar pustaka:</w:t>
       </w:r>
     </w:p>
     <w:p>
       <w:pPr>
-        <w:spacing w:line="240" w:lineRule="auto"/>
+        <w:spacing w:before="0" w:after="120" w:line="276" w:lineRule="auto"/>
+        <w:jc w:val="both"/>
+      </w:pPr>
+      <w:r>
+        <w:rPr>
+          <w:sz w:val="22"/>
+        </w:rPr>
+        <w:t>1. Antonopoulos, A. M. dan Wood, G. (2018). Mastering Ethereum. O'Reilly Media.</w:t>
+      </w:r>
+    </w:p>
+    <w:p>
+      <w:pPr>
+        <w:spacing w:before="0" w:after="120" w:line="276" w:lineRule="auto"/>
+        <w:jc w:val="both"/>
+      </w:pPr>
+      <w:r>
+        <w:rPr>
+          <w:sz w:val="22"/>
+        </w:rPr>
+        <w:t>2. Feist, J., Grieco, G., dan Groce, A. (2019). Slither: A Static Analysis Framework for Smart Contracts. WETSEB 2019.</w:t>
+      </w:r>
+    </w:p>
+    <w:p>
+      <w:pPr>
+        <w:spacing w:before="0" w:after="120" w:line="276" w:lineRule="auto"/>
+        <w:jc w:val="both"/>
+      </w:pPr>
+      <w:r>
+        <w:rPr>
+          <w:sz w:val="22"/>
+        </w:rPr>
+        <w:t>3. Dokumentasi Solidity. docs.soliditylang.org (diakses Oktober 2026).</w:t>
+      </w:r>
+    </w:p>
+    <w:p>
+      <w:pPr>
+        <w:spacing w:before="0" w:after="120" w:line="276" w:lineRule="auto"/>
+        <w:jc w:val="both"/>
+      </w:pPr>
+      <w:r>
+        <w:rPr>
+          <w:sz w:val="22"/>
+        </w:rPr>
+        <w:t>4. Dokumentasi Hardhat. hardhat.org.</w:t>
+      </w:r>
+    </w:p>
+    <w:p>
+      <w:pPr>
+        <w:spacing w:before="0" w:after="120" w:line="276" w:lineRule="auto"/>
+        <w:jc w:val="both"/>
+      </w:pPr>
+      <w:r>
+        <w:rPr>
+          <w:sz w:val="22"/>
+        </w:rPr>
+        <w:t>5. Dokumentasi ethers.js v6. docs.ethers.org/v6.</w:t>
+      </w:r>
+    </w:p>
+    <w:p>
+      <w:pPr>
+        <w:spacing w:before="0" w:after="120" w:line="276" w:lineRule="auto"/>
+        <w:jc w:val="both"/>
+      </w:pPr>
+      <w:r>
+        <w:rPr>
+          <w:sz w:val="22"/>
+        </w:rPr>
+        <w:t>6. OpenZeppelin Contracts Documentation. docs.openzeppelin.com/contracts.</w:t>
+      </w:r>
+    </w:p>
+    <w:p>
+      <w:pPr>
+        <w:spacing w:before="0" w:after="120" w:line="276" w:lineRule="auto"/>
+        <w:jc w:val="both"/>
+      </w:pPr>
+      <w:r>
+        <w:rPr>
+          <w:sz w:val="22"/>
+        </w:rPr>
+        <w:t>7. Smart Contract Weakness Classification Registry. swcregistry.io.</w:t>
+      </w:r>
+    </w:p>
+    <w:p>
+      <w:pPr>
+        <w:spacing w:before="0" w:after="120" w:line="276" w:lineRule="auto"/>
+        <w:jc w:val="both"/>
+      </w:pPr>
+      <w:r>
+        <w:rPr>
+          <w:sz w:val="22"/>
+        </w:rPr>
+        <w:t>8. Hyperledger Fabric Documentation. hyperledger-fabric.readthedocs.io.</w:t>
+      </w:r>
+    </w:p>
+    <w:p>
+      <w:pPr>
+        <w:spacing w:before="0" w:after="120" w:line="276" w:lineRule="auto"/>
+        <w:jc w:val="both"/>
+      </w:pPr>
+      <w:r>
+        <w:rPr>
+          <w:sz w:val="22"/>
+        </w:rPr>
+        <w:t>9. Hyperledger Besu Documentation. besu.hyperledger.org.</w:t>
+      </w:r>
+    </w:p>
+    <w:p>
+      <w:pPr>
+        <w:spacing w:before="0" w:after="120" w:line="276" w:lineRule="auto"/>
+        <w:jc w:val="both"/>
+      </w:pPr>
+      <w:r>
+        <w:rPr>
+          <w:sz w:val="22"/>
+        </w:rPr>
+        <w:t>10. Undang-Undang Nomor 27 Tahun 2022 tentang Pelindungan Data Pribadi.</w:t>
+      </w:r>
+    </w:p>
+    <w:p>
+      <w:pPr>
+        <w:spacing w:before="0" w:after="120" w:line="276" w:lineRule="auto"/>
+        <w:jc w:val="both"/>
+      </w:pPr>
+      <w:r>
+        <w:rPr>
+          <w:sz w:val="22"/>
+        </w:rPr>
+        <w:t>11. Materi kuliah Blockchain, Universitas Siliwangi, TA 2026/2027.</w:t>
+      </w:r>
+    </w:p>
+    <w:p>
+      <w:pPr>
+        <w:spacing w:before="0" w:after="120" w:line="276" w:lineRule="auto"/>
+        <w:jc w:val="both"/>
+      </w:pPr>
+      <w:r>
+        <w:rPr>
+          <w:sz w:val="22"/>
+        </w:rPr>
+        <w:t>Seluruh kode kontrak ditulis sendiri oleh penulis. Pola Checks-Effects-Interactions dan reentrancy guard mengikuti praktik umum yang dijelaskan pada dokumentasi di atas.</w:t>
+      </w:r>
+    </w:p>
+    <w:p>
+      <w:pPr>
+        <w:spacing w:line="276" w:lineRule="auto" w:before="0" w:after="120"/>
         <w:jc w:val="both"/>
         <w:rPr>
           <w:sz w:val="24"/>
@@ -9490,17 +9837,17 @@
         </w:rPr>
       </w:pPr>
       <w:r>
-        <w:rPr/>
+        <w:rPr>
+          <w:b/>
+          <w:sz w:val="22"/>
+        </w:rPr>
+        <w:t xml:space="preserve">Lampiran: </w:t>
       </w:r>
       <w:r>
         <w:rPr>
-          <w:b/>
+          <w:sz w:val="22"/>
         </w:rPr>
-        <w:t xml:space="preserve">Lampiran/paket: </w:t>
-      </w:r>
-      <w:r>
-        <w:rPr/>
-        <w:t>README.md; kode kontrak (contracts/) dan client (scripts/, frontend/); folder test/ dan hasil pengujian; Deployment_Record.pdf; Security_Audit.pdf beserta bukti perbaikan; Architecture_Diagram.png; Slide_Presentasi.pptx; riwayat commit; video cadangan (Video_Demo.mp4, dibuat tim). Pemetaan kode bukti:</w:t>
+        <w:t>README.md; kode kontrak (contracts/) dan client (scripts/, frontend/); folder test/ beserta hasilnya; Deployment_Record.pdf; Security_Audit.pdf; Architecture_Diagram.png; Slide_Presentasi.pptx; riwayat commit; dan video cadangan (Video_Demo.mp4). Pemetaan kode bukti:</w:t>
       </w:r>
     </w:p>
     <w:tbl>
@@ -10182,7 +10529,7 @@
                 <w:sz w:val="16"/>
                 <w:szCs w:val="24"/>
               </w:rPr>
-              <w:t>Deployment address dan tx hash</w:t>
+              <w:t>Address dan tx hash deployment</w:t>
             </w:r>
           </w:p>
         </w:tc>
@@ -11151,7 +11498,8 @@
       <w:rFonts w:asciiTheme="majorHAnsi" w:eastAsiaTheme="majorEastAsia" w:hAnsiTheme="majorHAnsi" w:cstheme="majorBidi"/>
       <w:b/>
       <w:bCs/>
-      <w:color w:val="4F81BD" w:themeColor="accent1"/>
+      <w:color w:val="0B6B3A"/>
+      <w:sz w:val="22"/>
     </w:rPr>
   </w:style>
   <w:style w:type="paragraph" w:styleId="Heading4">

</xml_diff>